<commit_message>
cleaning up pickleball stuff
</commit_message>
<xml_diff>
--- a/frhinehart/Pickleball/Module/pickleball_worksheet.docx
+++ b/frhinehart/Pickleball/Module/pickleball_worksheet.docx
@@ -1,259 +1,687 @@
 
 <file path=word/document.xml><?xml version="1.0" encoding="utf-8"?>
-<w:document xmlns:w="http://schemas.openxmlformats.org/wordprocessingml/2006/main" xmlns:m="http://schemas.openxmlformats.org/officeDocument/2006/math" xmlns:r="http://schemas.openxmlformats.org/officeDocument/2006/relationships" xmlns:o="urn:schemas-microsoft-com:office:office" xmlns:v="urn:schemas-microsoft-com:vml" xmlns:w10="urn:schemas-microsoft-com:office:word" xmlns:a="http://schemas.openxmlformats.org/drawingml/2006/main" xmlns:pic="http://schemas.openxmlformats.org/drawingml/2006/picture" xmlns:wp="http://schemas.openxmlformats.org/drawingml/2006/wordprocessingDrawing">
+<w:document xmlns:wpc="http://schemas.microsoft.com/office/word/2010/wordprocessingCanvas" xmlns:cx="http://schemas.microsoft.com/office/drawing/2014/chartex" xmlns:cx1="http://schemas.microsoft.com/office/drawing/2015/9/8/chartex" xmlns:mc="http://schemas.openxmlformats.org/markup-compatibility/2006" xmlns:o="urn:schemas-microsoft-com:office:office" xmlns:r="http://schemas.openxmlformats.org/officeDocument/2006/relationships" xmlns:m="http://schemas.openxmlformats.org/officeDocument/2006/math" xmlns:v="urn:schemas-microsoft-com:vml" xmlns:wp14="http://schemas.microsoft.com/office/word/2010/wordprocessingDrawing" xmlns:wp="http://schemas.openxmlformats.org/drawingml/2006/wordprocessingDrawing" xmlns:w10="urn:schemas-microsoft-com:office:word" xmlns:w="http://schemas.openxmlformats.org/wordprocessingml/2006/main" xmlns:w14="http://schemas.microsoft.com/office/word/2010/wordml" xmlns:w15="http://schemas.microsoft.com/office/word/2012/wordml" xmlns:w16se="http://schemas.microsoft.com/office/word/2015/wordml/symex" xmlns:wpg="http://schemas.microsoft.com/office/word/2010/wordprocessingGroup" xmlns:wpi="http://schemas.microsoft.com/office/word/2010/wordprocessingInk" xmlns:wne="http://schemas.microsoft.com/office/word/2006/wordml" xmlns:wps="http://schemas.microsoft.com/office/word/2010/wordprocessingShape" mc:Ignorable="w14 w15 w16se wp14">
   <w:body>
     <w:p>
       <w:pPr>
-        <w:pStyle w:val="Title"/>
-      </w:pPr>
-      <w:r>
-        <w:t xml:space="preserve">Pickleball Matched Pairs Worksheet</w:t>
+        <w:pStyle w:val="FirstParagraph"/>
+        <w:rPr>
+          <w:rFonts w:ascii="Calibri" w:hAnsi="Calibri" w:cs="Calibri"/>
+          <w:sz w:val="22"/>
+          <w:szCs w:val="22"/>
+        </w:rPr>
+      </w:pPr>
+      <w:proofErr w:type="spellStart"/>
+      <w:r>
+        <w:rPr>
+          <w:rFonts w:ascii="Calibri" w:hAnsi="Calibri" w:cs="Calibri"/>
+          <w:sz w:val="22"/>
+          <w:szCs w:val="22"/>
+        </w:rPr>
+        <w:t>Pickleball</w:t>
+      </w:r>
+      <w:proofErr w:type="spellEnd"/>
+      <w:r>
+        <w:rPr>
+          <w:rFonts w:ascii="Calibri" w:hAnsi="Calibri" w:cs="Calibri"/>
+          <w:sz w:val="22"/>
+          <w:szCs w:val="22"/>
+        </w:rPr>
+        <w:t xml:space="preserve"> is a fast-paced sport blending tennis, badminton, and ping-pong, played with paddles and a plastic ball on a small court. College tournaments feature singles, doubles, and mixed doubles in a best-of-three format, emphasizing strategy, teamwork, </w:t>
+      </w:r>
+      <w:r>
+        <w:rPr>
+          <w:rFonts w:ascii="Calibri" w:hAnsi="Calibri" w:cs="Calibri"/>
+          <w:sz w:val="22"/>
+          <w:szCs w:val="22"/>
+        </w:rPr>
+        <w:t>and precision. Player performance is often tracked using the DUPR (Dynamic Universal Pickleball Rating) system, which rates skill from 2.000 to 8.000 based on match results, opponent strength, and recent play. A Reliability Score (1–100%) reflects how accu</w:t>
+      </w:r>
+      <w:r>
+        <w:rPr>
+          <w:rFonts w:ascii="Calibri" w:hAnsi="Calibri" w:cs="Calibri"/>
+          <w:sz w:val="22"/>
+          <w:szCs w:val="22"/>
+        </w:rPr>
+        <w:t>rate a rating is, with 60%+ considered dependable.</w:t>
       </w:r>
     </w:p>
     <w:p>
       <w:pPr>
-        <w:pStyle w:val="FirstParagraph"/>
-      </w:pPr>
-      <w:r>
-        <w:t xml:space="preserve">Pickleball is a fast-paced sport blending tennis, badminton, and ping-pong, played with paddles and a plastic ball on a small court. College tournaments feature singles, doubles, and mixed doubles in a best-of-three format, emphasizing strategy, teamwork, and precision. Player performance is often tracked using the DUPR (Dynamic Universal Pickleball Rating) system, which rates skill from 2.000 to 8.000 based on match results, opponent strength, and recent play. A Reliability Score (1–100%) reflects how accurate a rating is, with 60%+ considered dependable.</w:t>
+        <w:pStyle w:val="BodyText"/>
+        <w:rPr>
+          <w:rFonts w:ascii="Calibri" w:hAnsi="Calibri" w:cs="Calibri"/>
+          <w:sz w:val="22"/>
+          <w:szCs w:val="22"/>
+        </w:rPr>
+      </w:pPr>
+      <w:r>
+        <w:rPr>
+          <w:rFonts w:ascii="Calibri" w:hAnsi="Calibri" w:cs="Calibri"/>
+          <w:sz w:val="22"/>
+          <w:szCs w:val="22"/>
+        </w:rPr>
+        <w:t xml:space="preserve">The file </w:t>
+      </w:r>
+      <w:r>
+        <w:rPr>
+          <w:rFonts w:ascii="Calibri" w:hAnsi="Calibri" w:cs="Calibri"/>
+          <w:b/>
+          <w:sz w:val="22"/>
+          <w:szCs w:val="22"/>
+        </w:rPr>
+        <w:t>pickleBall.csv</w:t>
+      </w:r>
+      <w:r>
+        <w:rPr>
+          <w:rFonts w:ascii="Calibri" w:hAnsi="Calibri" w:cs="Calibri"/>
+          <w:sz w:val="22"/>
+          <w:szCs w:val="22"/>
+        </w:rPr>
+        <w:t xml:space="preserve"> contains the ratings and reliability scores for collegiate matches from 2024. Open this</w:t>
+      </w:r>
+      <w:r>
+        <w:rPr>
+          <w:rFonts w:ascii="Calibri" w:hAnsi="Calibri" w:cs="Calibri"/>
+          <w:sz w:val="22"/>
+          <w:szCs w:val="22"/>
+        </w:rPr>
+        <w:t xml:space="preserve"> </w:t>
+      </w:r>
+      <w:r>
+        <w:rPr>
+          <w:rFonts w:ascii="Calibri" w:hAnsi="Calibri" w:cs="Calibri"/>
+          <w:sz w:val="22"/>
+          <w:szCs w:val="22"/>
+        </w:rPr>
+        <w:t>dataset in your statistical software of choice.</w:t>
       </w:r>
     </w:p>
     <w:p>
       <w:pPr>
         <w:pStyle w:val="BodyText"/>
-      </w:pPr>
-      <w:r>
-        <w:t xml:space="preserve">Read in the Dataset:</w:t>
-      </w:r>
-    </w:p>
-    <w:bookmarkStart w:id="20" w:name="creating-a-boxplot"/>
-    <w:p>
-      <w:pPr>
-        <w:pStyle w:val="Heading2"/>
-      </w:pPr>
-      <w:r>
-        <w:t xml:space="preserve">1 - Creating a boxplot</w:t>
+        <w:numPr>
+          <w:ilvl w:val="0"/>
+          <w:numId w:val="9"/>
+        </w:numPr>
+        <w:rPr>
+          <w:rFonts w:ascii="Calibri" w:hAnsi="Calibri" w:cs="Calibri"/>
+          <w:sz w:val="22"/>
+          <w:szCs w:val="22"/>
+        </w:rPr>
+      </w:pPr>
+      <w:r>
+        <w:rPr>
+          <w:rFonts w:ascii="Calibri" w:hAnsi="Calibri" w:cs="Calibri"/>
+          <w:sz w:val="22"/>
+          <w:szCs w:val="22"/>
+        </w:rPr>
+        <w:t>Visualizing Reliability scores</w:t>
       </w:r>
     </w:p>
     <w:p>
       <w:pPr>
         <w:numPr>
           <w:ilvl w:val="0"/>
-          <w:numId w:val="1001"/>
+          <w:numId w:val="2"/>
         </w:numPr>
-      </w:pPr>
-      <w:r>
-        <w:t xml:space="preserve">Create a boxplot comparing Singles and Doubles Reliability scores.</w:t>
+        <w:rPr>
+          <w:rFonts w:ascii="Calibri" w:hAnsi="Calibri" w:cs="Calibri"/>
+          <w:sz w:val="22"/>
+          <w:szCs w:val="22"/>
+        </w:rPr>
+      </w:pPr>
+      <w:bookmarkStart w:id="0" w:name="creating-a-boxplot"/>
+      <w:r>
+        <w:rPr>
+          <w:rFonts w:ascii="Calibri" w:hAnsi="Calibri" w:cs="Calibri"/>
+          <w:sz w:val="22"/>
+          <w:szCs w:val="22"/>
+        </w:rPr>
+        <w:t>Create a boxplot comparing Singles and Doubles Reliability scores.</w:t>
       </w:r>
     </w:p>
     <w:p>
       <w:pPr>
         <w:numPr>
           <w:ilvl w:val="0"/>
-          <w:numId w:val="1001"/>
+          <w:numId w:val="2"/>
         </w:numPr>
-      </w:pPr>
-      <w:r>
-        <w:t xml:space="preserve">What do you notice about the center, spread, and any outliers in the distributions? Which category appears to have a higher average reliability?</w:t>
+        <w:rPr>
+          <w:rFonts w:ascii="Calibri" w:hAnsi="Calibri" w:cs="Calibri"/>
+          <w:sz w:val="22"/>
+          <w:szCs w:val="22"/>
+        </w:rPr>
+      </w:pPr>
+      <w:r>
+        <w:rPr>
+          <w:rFonts w:ascii="Calibri" w:hAnsi="Calibri" w:cs="Calibri"/>
+          <w:sz w:val="22"/>
+          <w:szCs w:val="22"/>
+        </w:rPr>
+        <w:t>What do you notice about the center, spread, and any outliers in the distributions? Which cate</w:t>
+      </w:r>
+      <w:r>
+        <w:rPr>
+          <w:rFonts w:ascii="Calibri" w:hAnsi="Calibri" w:cs="Calibri"/>
+          <w:sz w:val="22"/>
+          <w:szCs w:val="22"/>
+        </w:rPr>
+        <w:t>gory appears to have a higher average reliability?</w:t>
       </w:r>
     </w:p>
     <w:p>
       <w:pPr>
         <w:pStyle w:val="FirstParagraph"/>
-      </w:pPr>
-      <w:r>
-        <w:t xml:space="preserve">We want to perform a hypothesis test to test if there is a significant difference between singles and doubles reliability. Because each player was measured twice (single and double reliability), we want to use a matched pairs t-test to perform the hypothesis test.</w:t>
-      </w:r>
-    </w:p>
-    <w:bookmarkEnd w:id="20"/>
-    <w:bookmarkStart w:id="21" w:name="checking-conditions"/>
-    <w:p>
-      <w:pPr>
-        <w:pStyle w:val="Heading2"/>
-      </w:pPr>
-      <w:r>
-        <w:t xml:space="preserve">2 - Checking conditions</w:t>
+        <w:rPr>
+          <w:rFonts w:ascii="Calibri" w:hAnsi="Calibri" w:cs="Calibri"/>
+          <w:sz w:val="22"/>
+          <w:szCs w:val="22"/>
+        </w:rPr>
+      </w:pPr>
+      <w:bookmarkStart w:id="1" w:name="_GoBack"/>
+      <w:r>
+        <w:rPr>
+          <w:rFonts w:ascii="Calibri" w:hAnsi="Calibri" w:cs="Calibri"/>
+          <w:b/>
+          <w:sz w:val="22"/>
+          <w:szCs w:val="22"/>
+        </w:rPr>
+        <w:t>Research Question:</w:t>
+      </w:r>
+      <w:bookmarkEnd w:id="1"/>
+      <w:r>
+        <w:rPr>
+          <w:rFonts w:ascii="Calibri" w:hAnsi="Calibri" w:cs="Calibri"/>
+          <w:sz w:val="22"/>
+          <w:szCs w:val="22"/>
+        </w:rPr>
+        <w:t xml:space="preserve"> </w:t>
+      </w:r>
+      <w:r>
+        <w:rPr>
+          <w:rFonts w:ascii="Calibri" w:hAnsi="Calibri" w:cs="Calibri"/>
+          <w:sz w:val="22"/>
+          <w:szCs w:val="22"/>
+        </w:rPr>
+        <w:t xml:space="preserve">We want to </w:t>
+      </w:r>
+      <w:r>
+        <w:rPr>
+          <w:rFonts w:ascii="Calibri" w:hAnsi="Calibri" w:cs="Calibri"/>
+          <w:sz w:val="22"/>
+          <w:szCs w:val="22"/>
+        </w:rPr>
+        <w:t xml:space="preserve">determine </w:t>
+      </w:r>
+      <w:r>
+        <w:rPr>
+          <w:rFonts w:ascii="Calibri" w:hAnsi="Calibri" w:cs="Calibri"/>
+          <w:sz w:val="22"/>
+          <w:szCs w:val="22"/>
+        </w:rPr>
+        <w:t xml:space="preserve">if there is a </w:t>
+      </w:r>
+      <w:r>
+        <w:rPr>
+          <w:rFonts w:ascii="Calibri" w:hAnsi="Calibri" w:cs="Calibri"/>
+          <w:sz w:val="22"/>
+          <w:szCs w:val="22"/>
+        </w:rPr>
+        <w:t xml:space="preserve">discernible </w:t>
+      </w:r>
+      <w:r>
+        <w:rPr>
+          <w:rFonts w:ascii="Calibri" w:hAnsi="Calibri" w:cs="Calibri"/>
+          <w:sz w:val="22"/>
+          <w:szCs w:val="22"/>
+        </w:rPr>
+        <w:t>difference between</w:t>
+      </w:r>
+      <w:r>
+        <w:rPr>
+          <w:rFonts w:ascii="Calibri" w:hAnsi="Calibri" w:cs="Calibri"/>
+          <w:sz w:val="22"/>
+          <w:szCs w:val="22"/>
+        </w:rPr>
+        <w:t xml:space="preserve"> the mean </w:t>
+      </w:r>
+      <w:r>
+        <w:rPr>
+          <w:rFonts w:ascii="Calibri" w:hAnsi="Calibri" w:cs="Calibri"/>
+          <w:sz w:val="22"/>
+          <w:szCs w:val="22"/>
+        </w:rPr>
+        <w:t>singles and doubles reliability</w:t>
+      </w:r>
+      <w:r>
+        <w:rPr>
+          <w:rFonts w:ascii="Calibri" w:hAnsi="Calibri" w:cs="Calibri"/>
+          <w:sz w:val="22"/>
+          <w:szCs w:val="22"/>
+        </w:rPr>
+        <w:t xml:space="preserve"> scores</w:t>
+      </w:r>
+      <w:r>
+        <w:rPr>
+          <w:rFonts w:ascii="Calibri" w:hAnsi="Calibri" w:cs="Calibri"/>
+          <w:sz w:val="22"/>
+          <w:szCs w:val="22"/>
+        </w:rPr>
+        <w:t xml:space="preserve">. </w:t>
       </w:r>
     </w:p>
     <w:p>
       <w:pPr>
+        <w:pStyle w:val="FirstParagraph"/>
+        <w:rPr>
+          <w:rFonts w:ascii="Calibri" w:hAnsi="Calibri" w:cs="Calibri"/>
+          <w:sz w:val="22"/>
+          <w:szCs w:val="22"/>
+        </w:rPr>
+      </w:pPr>
+    </w:p>
+    <w:p>
+      <w:pPr>
+        <w:pStyle w:val="FirstParagraph"/>
         <w:numPr>
           <w:ilvl w:val="0"/>
-          <w:numId w:val="1002"/>
+          <w:numId w:val="9"/>
         </w:numPr>
-      </w:pPr>
-      <w:r>
-        <w:t xml:space="preserve">Create a new column labeled</w:t>
-      </w:r>
-      <w:r>
-        <w:t xml:space="preserve"> </w:t>
-      </w:r>
-      <w:r>
-        <w:rPr>
-          <w:rStyle w:val="VerbatimChar"/>
-        </w:rPr>
-        <w:t xml:space="preserve">Difference</w:t>
-      </w:r>
-      <w:r>
-        <w:t xml:space="preserve"> </w:t>
-      </w:r>
-      <w:r>
-        <w:t xml:space="preserve">that takes Doubles Reliability minus Singles Reliability.</w:t>
+        <w:rPr>
+          <w:rFonts w:ascii="Calibri" w:hAnsi="Calibri" w:cs="Calibri"/>
+          <w:sz w:val="22"/>
+          <w:szCs w:val="22"/>
+        </w:rPr>
+      </w:pPr>
+      <w:r>
+        <w:rPr>
+          <w:rFonts w:ascii="Calibri" w:hAnsi="Calibri" w:cs="Calibri"/>
+          <w:sz w:val="22"/>
+          <w:szCs w:val="22"/>
+        </w:rPr>
+        <w:t>Explain why a</w:t>
+      </w:r>
+      <w:r>
+        <w:rPr>
+          <w:rFonts w:ascii="Calibri" w:hAnsi="Calibri" w:cs="Calibri"/>
+          <w:sz w:val="22"/>
+          <w:szCs w:val="22"/>
+        </w:rPr>
+        <w:t xml:space="preserve"> matched pairs t-test </w:t>
+      </w:r>
+      <w:r>
+        <w:rPr>
+          <w:rFonts w:ascii="Calibri" w:hAnsi="Calibri" w:cs="Calibri"/>
+          <w:sz w:val="22"/>
+          <w:szCs w:val="22"/>
+        </w:rPr>
+        <w:t>is likely a reasonable method to use to address the research question</w:t>
       </w:r>
     </w:p>
     <w:p>
       <w:pPr>
+        <w:pStyle w:val="Heading2"/>
+        <w:rPr>
+          <w:rFonts w:ascii="Calibri" w:hAnsi="Calibri" w:cs="Calibri"/>
+          <w:sz w:val="22"/>
+          <w:szCs w:val="22"/>
+        </w:rPr>
+      </w:pPr>
+      <w:bookmarkStart w:id="2" w:name="checking-conditions"/>
+      <w:bookmarkEnd w:id="0"/>
+      <w:r>
+        <w:rPr>
+          <w:rFonts w:ascii="Calibri" w:hAnsi="Calibri" w:cs="Calibri"/>
+          <w:sz w:val="22"/>
+          <w:szCs w:val="22"/>
+        </w:rPr>
+        <w:t>2 - Checking conditions</w:t>
+      </w:r>
+    </w:p>
+    <w:p>
+      <w:pPr>
         <w:numPr>
           <w:ilvl w:val="0"/>
-          <w:numId w:val="1002"/>
+          <w:numId w:val="3"/>
         </w:numPr>
-      </w:pPr>
-      <w:r>
-        <w:t xml:space="preserve">State and evaluate the three conditions needed for a paired t-test. You may assume independence. Use code to help justify normality and check for outliers.</w:t>
+        <w:rPr>
+          <w:rFonts w:ascii="Calibri" w:hAnsi="Calibri" w:cs="Calibri"/>
+          <w:sz w:val="22"/>
+          <w:szCs w:val="22"/>
+        </w:rPr>
+      </w:pPr>
+      <w:r>
+        <w:rPr>
+          <w:rFonts w:ascii="Calibri" w:hAnsi="Calibri" w:cs="Calibri"/>
+          <w:sz w:val="22"/>
+          <w:szCs w:val="22"/>
+        </w:rPr>
+        <w:t xml:space="preserve">Create a new column labeled </w:t>
+      </w:r>
+      <w:r>
+        <w:rPr>
+          <w:rStyle w:val="VerbatimChar"/>
+          <w:rFonts w:ascii="Calibri" w:hAnsi="Calibri" w:cs="Calibri"/>
+          <w:szCs w:val="22"/>
+        </w:rPr>
+        <w:t>Difference</w:t>
+      </w:r>
+      <w:r>
+        <w:rPr>
+          <w:rFonts w:ascii="Calibri" w:hAnsi="Calibri" w:cs="Calibri"/>
+          <w:sz w:val="22"/>
+          <w:szCs w:val="22"/>
+        </w:rPr>
+        <w:t xml:space="preserve"> that takes Doubles Reliability </w:t>
+      </w:r>
+      <w:proofErr w:type="gramStart"/>
+      <w:r>
+        <w:rPr>
+          <w:rFonts w:ascii="Calibri" w:hAnsi="Calibri" w:cs="Calibri"/>
+          <w:sz w:val="22"/>
+          <w:szCs w:val="22"/>
+        </w:rPr>
+        <w:t>minus</w:t>
+      </w:r>
+      <w:proofErr w:type="gramEnd"/>
+      <w:r>
+        <w:rPr>
+          <w:rFonts w:ascii="Calibri" w:hAnsi="Calibri" w:cs="Calibri"/>
+          <w:sz w:val="22"/>
+          <w:szCs w:val="22"/>
+        </w:rPr>
+        <w:t xml:space="preserve"> Singles Reliability.</w:t>
       </w:r>
     </w:p>
     <w:p>
       <w:pPr>
         <w:numPr>
           <w:ilvl w:val="0"/>
-          <w:numId w:val="1003"/>
+          <w:numId w:val="3"/>
         </w:numPr>
-      </w:pPr>
-      <w:r>
-        <w:t xml:space="preserve">Independence:</w:t>
+        <w:rPr>
+          <w:rFonts w:ascii="Calibri" w:hAnsi="Calibri" w:cs="Calibri"/>
+          <w:sz w:val="22"/>
+          <w:szCs w:val="22"/>
+        </w:rPr>
+      </w:pPr>
+      <w:r>
+        <w:rPr>
+          <w:rFonts w:ascii="Calibri" w:hAnsi="Calibri" w:cs="Calibri"/>
+          <w:sz w:val="22"/>
+          <w:szCs w:val="22"/>
+        </w:rPr>
+        <w:t>State and evaluate the three conditions needed for a paired t-test. You may</w:t>
+      </w:r>
+      <w:r>
+        <w:rPr>
+          <w:rFonts w:ascii="Calibri" w:hAnsi="Calibri" w:cs="Calibri"/>
+          <w:sz w:val="22"/>
+          <w:szCs w:val="22"/>
+        </w:rPr>
+        <w:t xml:space="preserve"> assume independence. Use code to help justify normality and check for outliers.</w:t>
       </w:r>
     </w:p>
     <w:p>
       <w:pPr>
         <w:numPr>
           <w:ilvl w:val="0"/>
-          <w:numId w:val="1003"/>
+          <w:numId w:val="4"/>
         </w:numPr>
-      </w:pPr>
-      <w:r>
-        <w:t xml:space="preserve">Normality:</w:t>
+        <w:rPr>
+          <w:rFonts w:ascii="Calibri" w:hAnsi="Calibri" w:cs="Calibri"/>
+          <w:sz w:val="22"/>
+          <w:szCs w:val="22"/>
+        </w:rPr>
+      </w:pPr>
+      <w:r>
+        <w:rPr>
+          <w:rFonts w:ascii="Calibri" w:hAnsi="Calibri" w:cs="Calibri"/>
+          <w:sz w:val="22"/>
+          <w:szCs w:val="22"/>
+        </w:rPr>
+        <w:t>Independence:</w:t>
       </w:r>
     </w:p>
     <w:p>
       <w:pPr>
         <w:numPr>
           <w:ilvl w:val="0"/>
-          <w:numId w:val="1003"/>
+          <w:numId w:val="4"/>
         </w:numPr>
-      </w:pPr>
-      <w:r>
-        <w:t xml:space="preserve">No Extreme Outliers:</w:t>
-      </w:r>
-    </w:p>
-    <w:bookmarkEnd w:id="21"/>
-    <w:bookmarkStart w:id="22" w:name="X5132c3e64d9a4fc263cd258049994395dbfd6af"/>
-    <w:p>
-      <w:pPr>
-        <w:pStyle w:val="Heading2"/>
-      </w:pPr>
-      <w:r>
-        <w:t xml:space="preserve">3 - Performing a matched pairs hypothesis test manually.</w:t>
+        <w:rPr>
+          <w:rFonts w:ascii="Calibri" w:hAnsi="Calibri" w:cs="Calibri"/>
+          <w:sz w:val="22"/>
+          <w:szCs w:val="22"/>
+        </w:rPr>
+      </w:pPr>
+      <w:r>
+        <w:rPr>
+          <w:rFonts w:ascii="Calibri" w:hAnsi="Calibri" w:cs="Calibri"/>
+          <w:sz w:val="22"/>
+          <w:szCs w:val="22"/>
+        </w:rPr>
+        <w:t>Normality:</w:t>
       </w:r>
     </w:p>
     <w:p>
       <w:pPr>
+        <w:numPr>
+          <w:ilvl w:val="0"/>
+          <w:numId w:val="4"/>
+        </w:numPr>
+        <w:rPr>
+          <w:rFonts w:ascii="Calibri" w:hAnsi="Calibri" w:cs="Calibri"/>
+          <w:sz w:val="22"/>
+          <w:szCs w:val="22"/>
+        </w:rPr>
+      </w:pPr>
+      <w:r>
+        <w:rPr>
+          <w:rFonts w:ascii="Calibri" w:hAnsi="Calibri" w:cs="Calibri"/>
+          <w:sz w:val="22"/>
+          <w:szCs w:val="22"/>
+        </w:rPr>
+        <w:t>No Extreme Outliers:</w:t>
+      </w:r>
+    </w:p>
+    <w:p>
+      <w:pPr>
+        <w:pStyle w:val="Heading2"/>
+        <w:rPr>
+          <w:rFonts w:ascii="Calibri" w:hAnsi="Calibri" w:cs="Calibri"/>
+          <w:sz w:val="22"/>
+          <w:szCs w:val="22"/>
+        </w:rPr>
+      </w:pPr>
+      <w:bookmarkStart w:id="3" w:name="X5132c3e64d9a4fc263cd258049994395dbfd6af"/>
+      <w:bookmarkEnd w:id="2"/>
+      <w:r>
+        <w:rPr>
+          <w:rFonts w:ascii="Calibri" w:hAnsi="Calibri" w:cs="Calibri"/>
+          <w:sz w:val="22"/>
+          <w:szCs w:val="22"/>
+        </w:rPr>
+        <w:t>3 - Performing a matched pairs hypothesis test manually.</w:t>
+      </w:r>
+    </w:p>
+    <w:p>
+      <w:pPr>
         <w:pStyle w:val="FirstParagraph"/>
-      </w:pPr>
-      <w:r>
-        <w:t xml:space="preserve">Let</w:t>
-      </w:r>
-      <w:r>
-        <w:t xml:space="preserve"> </w:t>
+        <w:rPr>
+          <w:rFonts w:ascii="Calibri" w:hAnsi="Calibri" w:cs="Calibri"/>
+          <w:sz w:val="22"/>
+          <w:szCs w:val="22"/>
+        </w:rPr>
+      </w:pPr>
+      <w:r>
+        <w:rPr>
+          <w:rFonts w:ascii="Calibri" w:hAnsi="Calibri" w:cs="Calibri"/>
+          <w:sz w:val="22"/>
+          <w:szCs w:val="22"/>
+        </w:rPr>
+        <w:t xml:space="preserve">Let </w:t>
       </w:r>
       <m:oMath>
         <m:r>
+          <w:rPr>
+            <w:rFonts w:ascii="Cambria Math" w:hAnsi="Cambria Math" w:cs="Calibri"/>
+            <w:sz w:val="22"/>
+            <w:szCs w:val="22"/>
+          </w:rPr>
           <m:t>μ</m:t>
         </m:r>
       </m:oMath>
       <w:r>
-        <w:t xml:space="preserve"> </w:t>
-      </w:r>
-      <w:r>
-        <w:t xml:space="preserve">be the true mean difference (Doubles - Singles) - because doubles reliability mean is higher than singles reliability.</w:t>
+        <w:rPr>
+          <w:rFonts w:ascii="Calibri" w:hAnsi="Calibri" w:cs="Calibri"/>
+          <w:sz w:val="22"/>
+          <w:szCs w:val="22"/>
+        </w:rPr>
+        <w:t xml:space="preserve"> be the true mean difference (Doubles - Singles) - because doubles</w:t>
+      </w:r>
+      <w:r>
+        <w:rPr>
+          <w:rFonts w:ascii="Calibri" w:hAnsi="Calibri" w:cs="Calibri"/>
+          <w:sz w:val="22"/>
+          <w:szCs w:val="22"/>
+        </w:rPr>
+        <w:t xml:space="preserve"> reliability mean is higher than singles reliability.</w:t>
       </w:r>
     </w:p>
     <w:p>
       <w:pPr>
         <w:numPr>
           <w:ilvl w:val="0"/>
-          <w:numId w:val="1004"/>
+          <w:numId w:val="5"/>
         </w:numPr>
-      </w:pPr>
-      <w:r>
-        <w:t xml:space="preserve">State the null and alternative hypothesis.</w:t>
+        <w:rPr>
+          <w:rFonts w:ascii="Calibri" w:hAnsi="Calibri" w:cs="Calibri"/>
+          <w:sz w:val="22"/>
+          <w:szCs w:val="22"/>
+        </w:rPr>
+      </w:pPr>
+      <w:r>
+        <w:rPr>
+          <w:rFonts w:ascii="Calibri" w:hAnsi="Calibri" w:cs="Calibri"/>
+          <w:sz w:val="22"/>
+          <w:szCs w:val="22"/>
+        </w:rPr>
+        <w:t>State the null and alternative hypothesis.</w:t>
       </w:r>
     </w:p>
     <w:p>
       <w:pPr>
         <w:numPr>
           <w:ilvl w:val="0"/>
-          <w:numId w:val="1004"/>
+          <w:numId w:val="5"/>
         </w:numPr>
-      </w:pPr>
-      <w:r>
-        <w:t xml:space="preserve">Calculate the mean difference of the</w:t>
-      </w:r>
-      <w:r>
-        <w:t xml:space="preserve"> </w:t>
+        <w:rPr>
+          <w:rFonts w:ascii="Calibri" w:hAnsi="Calibri" w:cs="Calibri"/>
+          <w:sz w:val="22"/>
+          <w:szCs w:val="22"/>
+        </w:rPr>
+      </w:pPr>
+      <w:r>
+        <w:rPr>
+          <w:rFonts w:ascii="Calibri" w:hAnsi="Calibri" w:cs="Calibri"/>
+          <w:sz w:val="22"/>
+          <w:szCs w:val="22"/>
+        </w:rPr>
+        <w:t xml:space="preserve">Calculate the mean difference of the </w:t>
       </w:r>
       <w:r>
         <w:rPr>
           <w:rStyle w:val="VerbatimChar"/>
-        </w:rPr>
-        <w:t xml:space="preserve">Difference</w:t>
-      </w:r>
-      <w:r>
-        <w:t xml:space="preserve"> </w:t>
-      </w:r>
-      <w:r>
-        <w:t xml:space="preserve">column. Report your result.</w:t>
+          <w:rFonts w:ascii="Calibri" w:hAnsi="Calibri" w:cs="Calibri"/>
+          <w:szCs w:val="22"/>
+        </w:rPr>
+        <w:t>Difference</w:t>
+      </w:r>
+      <w:r>
+        <w:rPr>
+          <w:rFonts w:ascii="Calibri" w:hAnsi="Calibri" w:cs="Calibri"/>
+          <w:sz w:val="22"/>
+          <w:szCs w:val="22"/>
+        </w:rPr>
+        <w:t xml:space="preserve"> column. Report your result.</w:t>
       </w:r>
     </w:p>
     <w:p>
       <w:pPr>
         <w:numPr>
           <w:ilvl w:val="0"/>
-          <w:numId w:val="1004"/>
+          <w:numId w:val="5"/>
         </w:numPr>
-      </w:pPr>
-      <w:r>
-        <w:t xml:space="preserve">Calculate the standard deviation of the</w:t>
-      </w:r>
-      <w:r>
-        <w:t xml:space="preserve"> </w:t>
+        <w:rPr>
+          <w:rFonts w:ascii="Calibri" w:hAnsi="Calibri" w:cs="Calibri"/>
+          <w:sz w:val="22"/>
+          <w:szCs w:val="22"/>
+        </w:rPr>
+      </w:pPr>
+      <w:r>
+        <w:rPr>
+          <w:rFonts w:ascii="Calibri" w:hAnsi="Calibri" w:cs="Calibri"/>
+          <w:sz w:val="22"/>
+          <w:szCs w:val="22"/>
+        </w:rPr>
+        <w:t xml:space="preserve">Calculate the standard deviation of the </w:t>
       </w:r>
       <w:r>
         <w:rPr>
           <w:rStyle w:val="VerbatimChar"/>
-        </w:rPr>
-        <w:t xml:space="preserve">Difference</w:t>
-      </w:r>
-      <w:r>
-        <w:t xml:space="preserve"> </w:t>
-      </w:r>
-      <w:r>
-        <w:t xml:space="preserve">column. Report your result.</w:t>
+          <w:rFonts w:ascii="Calibri" w:hAnsi="Calibri" w:cs="Calibri"/>
+          <w:szCs w:val="22"/>
+        </w:rPr>
+        <w:t>Difference</w:t>
+      </w:r>
+      <w:r>
+        <w:rPr>
+          <w:rFonts w:ascii="Calibri" w:hAnsi="Calibri" w:cs="Calibri"/>
+          <w:sz w:val="22"/>
+          <w:szCs w:val="22"/>
+        </w:rPr>
+        <w:t xml:space="preserve"> column. Report your result.</w:t>
       </w:r>
     </w:p>
     <w:p>
       <w:pPr>
         <w:numPr>
           <w:ilvl w:val="0"/>
-          <w:numId w:val="1004"/>
+          <w:numId w:val="5"/>
         </w:numPr>
-      </w:pPr>
-      <w:r>
-        <w:t xml:space="preserve">Calculate the t-statistic. The formula is below in which you can do it by hand or do it using r. Report your result.</w:t>
+        <w:rPr>
+          <w:rFonts w:ascii="Calibri" w:hAnsi="Calibri" w:cs="Calibri"/>
+          <w:sz w:val="22"/>
+          <w:szCs w:val="22"/>
+        </w:rPr>
+      </w:pPr>
+      <w:r>
+        <w:rPr>
+          <w:rFonts w:ascii="Calibri" w:hAnsi="Calibri" w:cs="Calibri"/>
+          <w:sz w:val="22"/>
+          <w:szCs w:val="22"/>
+        </w:rPr>
+        <w:t>Calc</w:t>
+      </w:r>
+      <w:r>
+        <w:rPr>
+          <w:rFonts w:ascii="Calibri" w:hAnsi="Calibri" w:cs="Calibri"/>
+          <w:sz w:val="22"/>
+          <w:szCs w:val="22"/>
+        </w:rPr>
+        <w:t>ulate the t-statistic. The formula is below in which you can do it by hand or do it using r. Report your result.</w:t>
       </w:r>
     </w:p>
     <w:p>
       <w:pPr>
         <w:pStyle w:val="BodyText"/>
+        <w:rPr>
+          <w:rFonts w:ascii="Calibri" w:hAnsi="Calibri" w:cs="Calibri"/>
+          <w:sz w:val="22"/>
+          <w:szCs w:val="22"/>
+        </w:rPr>
       </w:pPr>
       <m:oMathPara>
         <m:oMathParaPr>
@@ -261,25 +689,54 @@
         </m:oMathParaPr>
         <m:oMath>
           <m:r>
+            <w:rPr>
+              <w:rFonts w:ascii="Cambria Math" w:hAnsi="Cambria Math" w:cs="Calibri"/>
+              <w:sz w:val="22"/>
+              <w:szCs w:val="22"/>
+            </w:rPr>
+            <w:lastRenderedPageBreak/>
             <m:t>t</m:t>
           </m:r>
           <m:r>
             <m:rPr>
               <m:sty m:val="p"/>
             </m:rPr>
+            <w:rPr>
+              <w:rFonts w:ascii="Cambria Math" w:hAnsi="Cambria Math" w:cs="Calibri"/>
+              <w:sz w:val="22"/>
+              <w:szCs w:val="22"/>
+            </w:rPr>
             <m:t>=</m:t>
           </m:r>
           <m:f>
             <m:fPr>
-              <m:type m:val="bar"/>
+              <m:ctrlPr>
+                <w:rPr>
+                  <w:rFonts w:ascii="Cambria Math" w:hAnsi="Cambria Math" w:cs="Calibri"/>
+                  <w:sz w:val="22"/>
+                  <w:szCs w:val="22"/>
+                </w:rPr>
+              </m:ctrlPr>
             </m:fPr>
             <m:num>
               <m:acc>
                 <m:accPr>
                   <m:chr m:val="‾"/>
+                  <m:ctrlPr>
+                    <w:rPr>
+                      <w:rFonts w:ascii="Cambria Math" w:hAnsi="Cambria Math" w:cs="Calibri"/>
+                      <w:sz w:val="22"/>
+                      <w:szCs w:val="22"/>
+                    </w:rPr>
+                  </m:ctrlPr>
                 </m:accPr>
                 <m:e>
                   <m:r>
+                    <w:rPr>
+                      <w:rFonts w:ascii="Cambria Math" w:hAnsi="Cambria Math" w:cs="Calibri"/>
+                      <w:sz w:val="22"/>
+                      <w:szCs w:val="22"/>
+                    </w:rPr>
                     <m:t>D</m:t>
                   </m:r>
                 </m:e>
@@ -287,13 +744,32 @@
             </m:num>
             <m:den>
               <m:sSub>
+                <m:sSubPr>
+                  <m:ctrlPr>
+                    <w:rPr>
+                      <w:rFonts w:ascii="Cambria Math" w:hAnsi="Cambria Math" w:cs="Calibri"/>
+                      <w:sz w:val="22"/>
+                      <w:szCs w:val="22"/>
+                    </w:rPr>
+                  </m:ctrlPr>
+                </m:sSubPr>
                 <m:e>
                   <m:r>
+                    <w:rPr>
+                      <w:rFonts w:ascii="Cambria Math" w:hAnsi="Cambria Math" w:cs="Calibri"/>
+                      <w:sz w:val="22"/>
+                      <w:szCs w:val="22"/>
+                    </w:rPr>
                     <m:t>s</m:t>
                   </m:r>
                 </m:e>
                 <m:sub>
                   <m:r>
+                    <w:rPr>
+                      <w:rFonts w:ascii="Cambria Math" w:hAnsi="Cambria Math" w:cs="Calibri"/>
+                      <w:sz w:val="22"/>
+                      <w:szCs w:val="22"/>
+                    </w:rPr>
                     <m:t>D</m:t>
                   </m:r>
                 </m:sub>
@@ -302,15 +778,32 @@
                 <m:rPr>
                   <m:sty m:val="p"/>
                 </m:rPr>
+                <w:rPr>
+                  <w:rFonts w:ascii="Cambria Math" w:hAnsi="Cambria Math" w:cs="Calibri"/>
+                  <w:sz w:val="22"/>
+                  <w:szCs w:val="22"/>
+                </w:rPr>
                 <m:t>/</m:t>
               </m:r>
               <m:rad>
                 <m:radPr>
-                  <m:degHide m:val="on"/>
+                  <m:degHide m:val="1"/>
+                  <m:ctrlPr>
+                    <w:rPr>
+                      <w:rFonts w:ascii="Cambria Math" w:hAnsi="Cambria Math" w:cs="Calibri"/>
+                      <w:sz w:val="22"/>
+                      <w:szCs w:val="22"/>
+                    </w:rPr>
+                  </m:ctrlPr>
                 </m:radPr>
                 <m:deg/>
                 <m:e>
                   <m:r>
+                    <w:rPr>
+                      <w:rFonts w:ascii="Cambria Math" w:hAnsi="Cambria Math" w:cs="Calibri"/>
+                      <w:sz w:val="22"/>
+                      <w:szCs w:val="22"/>
+                    </w:rPr>
                     <m:t>n</m:t>
                   </m:r>
                 </m:e>
@@ -324,144 +817,336 @@
       <w:pPr>
         <w:numPr>
           <w:ilvl w:val="0"/>
-          <w:numId w:val="1004"/>
+          <w:numId w:val="5"/>
         </w:numPr>
-      </w:pPr>
-      <w:r>
-        <w:t xml:space="preserve">Calculate the degrees of freedom. Report your result.</w:t>
+        <w:rPr>
+          <w:rFonts w:ascii="Calibri" w:hAnsi="Calibri" w:cs="Calibri"/>
+          <w:sz w:val="22"/>
+          <w:szCs w:val="22"/>
+        </w:rPr>
+      </w:pPr>
+      <w:r>
+        <w:rPr>
+          <w:rFonts w:ascii="Calibri" w:hAnsi="Calibri" w:cs="Calibri"/>
+          <w:sz w:val="22"/>
+          <w:szCs w:val="22"/>
+        </w:rPr>
+        <w:t>Calculate the degrees of freedom. Report your result.</w:t>
       </w:r>
     </w:p>
     <w:p>
       <w:pPr>
         <w:numPr>
           <w:ilvl w:val="0"/>
-          <w:numId w:val="1004"/>
+          <w:numId w:val="5"/>
         </w:numPr>
-      </w:pPr>
-      <w:r>
-        <w:t xml:space="preserve">Calculate the p-value for two-tailed hypothesis. To do this do in R code - 2 * pt(-abs(t-statistic), df = degrees of freedom). Report your result.</w:t>
+        <w:rPr>
+          <w:rFonts w:ascii="Calibri" w:hAnsi="Calibri" w:cs="Calibri"/>
+          <w:sz w:val="22"/>
+          <w:szCs w:val="22"/>
+        </w:rPr>
+      </w:pPr>
+      <w:r>
+        <w:rPr>
+          <w:rFonts w:ascii="Calibri" w:hAnsi="Calibri" w:cs="Calibri"/>
+          <w:sz w:val="22"/>
+          <w:szCs w:val="22"/>
+        </w:rPr>
+        <w:t>Calculate the p-value for two-tailed hypothesis. To do this do in R code - 2</w:t>
+      </w:r>
+      <w:r>
+        <w:rPr>
+          <w:rFonts w:ascii="Calibri" w:hAnsi="Calibri" w:cs="Calibri"/>
+          <w:sz w:val="22"/>
+          <w:szCs w:val="22"/>
+        </w:rPr>
+        <w:t xml:space="preserve"> * pt(-abs(t-statistic), df = degrees of freedom). Report your result.</w:t>
       </w:r>
     </w:p>
     <w:p>
       <w:pPr>
         <w:numPr>
           <w:ilvl w:val="0"/>
-          <w:numId w:val="1004"/>
+          <w:numId w:val="5"/>
         </w:numPr>
-      </w:pPr>
-      <w:r>
-        <w:t xml:space="preserve">Use the p-value to make a conclusion.</w:t>
+        <w:rPr>
+          <w:rFonts w:ascii="Calibri" w:hAnsi="Calibri" w:cs="Calibri"/>
+          <w:sz w:val="22"/>
+          <w:szCs w:val="22"/>
+        </w:rPr>
+      </w:pPr>
+      <w:r>
+        <w:rPr>
+          <w:rFonts w:ascii="Calibri" w:hAnsi="Calibri" w:cs="Calibri"/>
+          <w:sz w:val="22"/>
+          <w:szCs w:val="22"/>
+        </w:rPr>
+        <w:t>Use the p-value to make a conclusion.</w:t>
       </w:r>
     </w:p>
     <w:p>
       <w:pPr>
         <w:pStyle w:val="FirstParagraph"/>
-      </w:pPr>
-      <w:r>
-        <w:t xml:space="preserve">A possible explanation for this is that doubles matches are more commonly played than single matches.</w:t>
+        <w:rPr>
+          <w:rFonts w:ascii="Calibri" w:hAnsi="Calibri" w:cs="Calibri"/>
+          <w:sz w:val="22"/>
+          <w:szCs w:val="22"/>
+        </w:rPr>
+      </w:pPr>
+      <w:r>
+        <w:rPr>
+          <w:rFonts w:ascii="Calibri" w:hAnsi="Calibri" w:cs="Calibri"/>
+          <w:sz w:val="22"/>
+          <w:szCs w:val="22"/>
+        </w:rPr>
+        <w:t>A possible explanation for this is that doubles matches are more commonly played than single matches.</w:t>
       </w:r>
     </w:p>
     <w:p>
       <w:pPr>
         <w:pStyle w:val="BodyText"/>
-      </w:pPr>
-      <w:r>
-        <w:t xml:space="preserve">We can also do this process using the t.test function in r which allows us to perform the hypothesis test quicker.</w:t>
-      </w:r>
-    </w:p>
-    <w:bookmarkEnd w:id="22"/>
-    <w:bookmarkStart w:id="23" w:name="X10059e762098f38e8957a565f3c8b00529f43b4"/>
-    <w:p>
-      <w:pPr>
-        <w:pStyle w:val="Heading2"/>
-      </w:pPr>
-      <w:r>
-        <w:t xml:space="preserve">4 - Performing a matched pairs hypothesis test using R function:</w:t>
+        <w:rPr>
+          <w:rFonts w:ascii="Calibri" w:hAnsi="Calibri" w:cs="Calibri"/>
+          <w:sz w:val="22"/>
+          <w:szCs w:val="22"/>
+        </w:rPr>
+      </w:pPr>
+      <w:r>
+        <w:rPr>
+          <w:rFonts w:ascii="Calibri" w:hAnsi="Calibri" w:cs="Calibri"/>
+          <w:sz w:val="22"/>
+          <w:szCs w:val="22"/>
+        </w:rPr>
+        <w:t xml:space="preserve">We can also do this process using the t.test </w:t>
+      </w:r>
+      <w:r>
+        <w:rPr>
+          <w:rFonts w:ascii="Calibri" w:hAnsi="Calibri" w:cs="Calibri"/>
+          <w:sz w:val="22"/>
+          <w:szCs w:val="22"/>
+        </w:rPr>
+        <w:t>function in r which allows us to perform the hypothesis test quicker.</w:t>
       </w:r>
     </w:p>
     <w:p>
       <w:pPr>
+        <w:pStyle w:val="Heading2"/>
+        <w:rPr>
+          <w:rFonts w:ascii="Calibri" w:hAnsi="Calibri" w:cs="Calibri"/>
+          <w:sz w:val="22"/>
+          <w:szCs w:val="22"/>
+        </w:rPr>
+      </w:pPr>
+      <w:bookmarkStart w:id="4" w:name="X10059e762098f38e8957a565f3c8b00529f43b4"/>
+      <w:bookmarkEnd w:id="3"/>
+      <w:r>
+        <w:rPr>
+          <w:rFonts w:ascii="Calibri" w:hAnsi="Calibri" w:cs="Calibri"/>
+          <w:sz w:val="22"/>
+          <w:szCs w:val="22"/>
+        </w:rPr>
+        <w:t>4 - Performing a matched pairs hypothesis test using R function:</w:t>
+      </w:r>
+    </w:p>
+    <w:p>
+      <w:pPr>
         <w:numPr>
           <w:ilvl w:val="0"/>
-          <w:numId w:val="1005"/>
+          <w:numId w:val="6"/>
         </w:numPr>
-      </w:pPr>
-      <w:r>
-        <w:t xml:space="preserve">Perform a matched pairs hypothesis t-test using the</w:t>
-      </w:r>
-      <w:r>
-        <w:t xml:space="preserve"> </w:t>
+        <w:rPr>
+          <w:rFonts w:ascii="Calibri" w:hAnsi="Calibri" w:cs="Calibri"/>
+          <w:sz w:val="22"/>
+          <w:szCs w:val="22"/>
+        </w:rPr>
+      </w:pPr>
+      <w:r>
+        <w:rPr>
+          <w:rFonts w:ascii="Calibri" w:hAnsi="Calibri" w:cs="Calibri"/>
+          <w:sz w:val="22"/>
+          <w:szCs w:val="22"/>
+        </w:rPr>
+        <w:t xml:space="preserve">Perform a matched pairs hypothesis t-test using the </w:t>
       </w:r>
       <w:r>
         <w:rPr>
           <w:rStyle w:val="VerbatimChar"/>
-        </w:rPr>
-        <w:t xml:space="preserve">t.test()</w:t>
-      </w:r>
-      <w:r>
-        <w:t xml:space="preserve"> </w:t>
-      </w:r>
-      <w:r>
-        <w:t xml:space="preserve">function and setting</w:t>
-      </w:r>
-      <w:r>
-        <w:t xml:space="preserve"> </w:t>
-      </w:r>
+          <w:rFonts w:ascii="Calibri" w:hAnsi="Calibri" w:cs="Calibri"/>
+          <w:szCs w:val="22"/>
+        </w:rPr>
+        <w:t>t.</w:t>
+      </w:r>
+      <w:proofErr w:type="gramStart"/>
       <w:r>
         <w:rPr>
           <w:rStyle w:val="VerbatimChar"/>
-        </w:rPr>
-        <w:t xml:space="preserve">paired = TRUE</w:t>
-      </w:r>
-      <w:r>
-        <w:t xml:space="preserve">. Include all parts of a formal hypothesis test.</w:t>
+          <w:rFonts w:ascii="Calibri" w:hAnsi="Calibri" w:cs="Calibri"/>
+          <w:szCs w:val="22"/>
+        </w:rPr>
+        <w:t>test(</w:t>
+      </w:r>
+      <w:proofErr w:type="gramEnd"/>
+      <w:r>
+        <w:rPr>
+          <w:rStyle w:val="VerbatimChar"/>
+          <w:rFonts w:ascii="Calibri" w:hAnsi="Calibri" w:cs="Calibri"/>
+          <w:szCs w:val="22"/>
+        </w:rPr>
+        <w:t>)</w:t>
+      </w:r>
+      <w:r>
+        <w:rPr>
+          <w:rFonts w:ascii="Calibri" w:hAnsi="Calibri" w:cs="Calibri"/>
+          <w:sz w:val="22"/>
+          <w:szCs w:val="22"/>
+        </w:rPr>
+        <w:t xml:space="preserve"> function and setting </w:t>
+      </w:r>
+      <w:r>
+        <w:rPr>
+          <w:rStyle w:val="VerbatimChar"/>
+          <w:rFonts w:ascii="Calibri" w:hAnsi="Calibri" w:cs="Calibri"/>
+          <w:szCs w:val="22"/>
+        </w:rPr>
+        <w:t>paired = TRUE</w:t>
+      </w:r>
+      <w:r>
+        <w:rPr>
+          <w:rFonts w:ascii="Calibri" w:hAnsi="Calibri" w:cs="Calibri"/>
+          <w:sz w:val="22"/>
+          <w:szCs w:val="22"/>
+        </w:rPr>
+        <w:t>. Include all parts of a formal hypothesis test.</w:t>
       </w:r>
     </w:p>
     <w:p>
       <w:pPr>
         <w:numPr>
           <w:ilvl w:val="0"/>
-          <w:numId w:val="1005"/>
+          <w:numId w:val="6"/>
         </w:numPr>
-      </w:pPr>
-      <w:r>
-        <w:t xml:space="preserve">Interpret the confidence interval results given in the output in part A.</w:t>
-      </w:r>
+        <w:rPr>
+          <w:rFonts w:ascii="Calibri" w:hAnsi="Calibri" w:cs="Calibri"/>
+          <w:sz w:val="22"/>
+          <w:szCs w:val="22"/>
+        </w:rPr>
+      </w:pPr>
+      <w:r>
+        <w:rPr>
+          <w:rFonts w:ascii="Calibri" w:hAnsi="Calibri" w:cs="Calibri"/>
+          <w:sz w:val="22"/>
+          <w:szCs w:val="22"/>
+        </w:rPr>
+        <w:t>Interpret the confidence interval results given in the output in part A.</w:t>
+      </w:r>
+      <w:bookmarkEnd w:id="4"/>
     </w:p>
-    <w:bookmarkEnd w:id="23"/>
-    <w:sectPr/>
+    <w:sectPr>
+      <w:headerReference w:type="default" r:id="rId7"/>
+      <w:pgSz w:w="12240" w:h="15840"/>
+      <w:pgMar w:top="1440" w:right="1440" w:bottom="1440" w:left="1440" w:header="720" w:footer="720" w:gutter="0"/>
+      <w:cols w:space="720"/>
+    </w:sectPr>
   </w:body>
 </w:document>
 </file>
 
-<file path=word/comments.xml><?xml version="1.0" encoding="utf-8"?>
-<w:comments xmlns:w="http://schemas.openxmlformats.org/wordprocessingml/2006/main" xmlns:m="http://schemas.openxmlformats.org/officeDocument/2006/math" xmlns:r="http://schemas.openxmlformats.org/officeDocument/2006/relationships" xmlns:o="urn:schemas-microsoft-com:office:office" xmlns:v="urn:schemas-microsoft-com:vml" xmlns:w10="urn:schemas-microsoft-com:office:word" xmlns:a="http://schemas.openxmlformats.org/drawingml/2006/main" xmlns:pic="http://schemas.openxmlformats.org/drawingml/2006/picture" xmlns:wp="http://schemas.openxmlformats.org/drawingml/2006/wordprocessingDrawing"/>
+<file path=word/endnotes.xml><?xml version="1.0" encoding="utf-8"?>
+<w:endnotes xmlns:wpc="http://schemas.microsoft.com/office/word/2010/wordprocessingCanvas" xmlns:cx="http://schemas.microsoft.com/office/drawing/2014/chartex" xmlns:cx1="http://schemas.microsoft.com/office/drawing/2015/9/8/chartex" xmlns:mc="http://schemas.openxmlformats.org/markup-compatibility/2006" xmlns:o="urn:schemas-microsoft-com:office:office" xmlns:r="http://schemas.openxmlformats.org/officeDocument/2006/relationships" xmlns:m="http://schemas.openxmlformats.org/officeDocument/2006/math" xmlns:v="urn:schemas-microsoft-com:vml" xmlns:wp14="http://schemas.microsoft.com/office/word/2010/wordprocessingDrawing" xmlns:wp="http://schemas.openxmlformats.org/drawingml/2006/wordprocessingDrawing" xmlns:w10="urn:schemas-microsoft-com:office:word" xmlns:w="http://schemas.openxmlformats.org/wordprocessingml/2006/main" xmlns:w14="http://schemas.microsoft.com/office/word/2010/wordml" xmlns:w15="http://schemas.microsoft.com/office/word/2012/wordml" xmlns:w16se="http://schemas.microsoft.com/office/word/2015/wordml/symex" xmlns:wpg="http://schemas.microsoft.com/office/word/2010/wordprocessingGroup" xmlns:wpi="http://schemas.microsoft.com/office/word/2010/wordprocessingInk" xmlns:wne="http://schemas.microsoft.com/office/word/2006/wordml" xmlns:wps="http://schemas.microsoft.com/office/word/2010/wordprocessingShape" mc:Ignorable="w14 w15 w16se wp14">
+  <w:endnote w:type="separator" w:id="-1">
+    <w:p>
+      <w:pPr>
+        <w:spacing w:after="0"/>
+      </w:pPr>
+      <w:r>
+        <w:separator/>
+      </w:r>
+    </w:p>
+  </w:endnote>
+  <w:endnote w:type="continuationSeparator" w:id="0">
+    <w:p>
+      <w:pPr>
+        <w:spacing w:after="0"/>
+      </w:pPr>
+      <w:r>
+        <w:continuationSeparator/>
+      </w:r>
+    </w:p>
+  </w:endnote>
+</w:endnotes>
 </file>
 
 <file path=word/footnotes.xml><?xml version="1.0" encoding="utf-8"?>
-<w:footnotes xmlns:w="http://schemas.openxmlformats.org/wordprocessingml/2006/main" xmlns:m="http://schemas.openxmlformats.org/officeDocument/2006/math" xmlns:r="http://schemas.openxmlformats.org/officeDocument/2006/relationships" xmlns:o="urn:schemas-microsoft-com:office:office" xmlns:v="urn:schemas-microsoft-com:vml" xmlns:w10="urn:schemas-microsoft-com:office:word" xmlns:a="http://schemas.openxmlformats.org/drawingml/2006/main" xmlns:pic="http://schemas.openxmlformats.org/drawingml/2006/picture" xmlns:wp="http://schemas.openxmlformats.org/drawingml/2006/wordprocessingDrawing">
+<w:footnotes xmlns:wpc="http://schemas.microsoft.com/office/word/2010/wordprocessingCanvas" xmlns:cx="http://schemas.microsoft.com/office/drawing/2014/chartex" xmlns:cx1="http://schemas.microsoft.com/office/drawing/2015/9/8/chartex" xmlns:mc="http://schemas.openxmlformats.org/markup-compatibility/2006" xmlns:o="urn:schemas-microsoft-com:office:office" xmlns:r="http://schemas.openxmlformats.org/officeDocument/2006/relationships" xmlns:m="http://schemas.openxmlformats.org/officeDocument/2006/math" xmlns:v="urn:schemas-microsoft-com:vml" xmlns:wp14="http://schemas.microsoft.com/office/word/2010/wordprocessingDrawing" xmlns:wp="http://schemas.openxmlformats.org/drawingml/2006/wordprocessingDrawing" xmlns:w10="urn:schemas-microsoft-com:office:word" xmlns:w="http://schemas.openxmlformats.org/wordprocessingml/2006/main" xmlns:w14="http://schemas.microsoft.com/office/word/2010/wordml" xmlns:w15="http://schemas.microsoft.com/office/word/2012/wordml" xmlns:w16se="http://schemas.microsoft.com/office/word/2015/wordml/symex" xmlns:wpg="http://schemas.microsoft.com/office/word/2010/wordprocessingGroup" xmlns:wpi="http://schemas.microsoft.com/office/word/2010/wordprocessingInk" xmlns:wne="http://schemas.microsoft.com/office/word/2006/wordml" xmlns:wps="http://schemas.microsoft.com/office/word/2010/wordprocessingShape" mc:Ignorable="w14 w15 w16se wp14">
+  <w:footnote w:type="separator" w:id="-1">
+    <w:p>
+      <w:pPr>
+        <w:spacing w:after="0"/>
+      </w:pPr>
+      <w:r>
+        <w:separator/>
+      </w:r>
+    </w:p>
+  </w:footnote>
   <w:footnote w:type="continuationSeparator" w:id="0">
     <w:p>
+      <w:pPr>
+        <w:spacing w:after="0"/>
+      </w:pPr>
       <w:r>
         <w:continuationSeparator/>
-      </w:r>
-    </w:p>
-  </w:footnote>
-  <w:footnote w:type="separator" w:id="-1">
-    <w:p>
-      <w:r>
-        <w:separator/>
       </w:r>
     </w:p>
   </w:footnote>
 </w:footnotes>
 </file>
 
+<file path=word/header1.xml><?xml version="1.0" encoding="utf-8"?>
+<w:hdr xmlns:wpc="http://schemas.microsoft.com/office/word/2010/wordprocessingCanvas" xmlns:cx="http://schemas.microsoft.com/office/drawing/2014/chartex" xmlns:cx1="http://schemas.microsoft.com/office/drawing/2015/9/8/chartex" xmlns:mc="http://schemas.openxmlformats.org/markup-compatibility/2006" xmlns:o="urn:schemas-microsoft-com:office:office" xmlns:r="http://schemas.openxmlformats.org/officeDocument/2006/relationships" xmlns:m="http://schemas.openxmlformats.org/officeDocument/2006/math" xmlns:v="urn:schemas-microsoft-com:vml" xmlns:wp14="http://schemas.microsoft.com/office/word/2010/wordprocessingDrawing" xmlns:wp="http://schemas.openxmlformats.org/drawingml/2006/wordprocessingDrawing" xmlns:w10="urn:schemas-microsoft-com:office:word" xmlns:w="http://schemas.openxmlformats.org/wordprocessingml/2006/main" xmlns:w14="http://schemas.microsoft.com/office/word/2010/wordml" xmlns:w15="http://schemas.microsoft.com/office/word/2012/wordml" xmlns:w16se="http://schemas.microsoft.com/office/word/2015/wordml/symex" xmlns:wpg="http://schemas.microsoft.com/office/word/2010/wordprocessingGroup" xmlns:wpi="http://schemas.microsoft.com/office/word/2010/wordprocessingInk" xmlns:wne="http://schemas.microsoft.com/office/word/2006/wordml" xmlns:wps="http://schemas.microsoft.com/office/word/2010/wordprocessingShape" mc:Ignorable="w14 w15 w16se wp14">
+  <w:p>
+    <w:pPr>
+      <w:pStyle w:val="Header"/>
+      <w:rPr>
+        <w:b/>
+      </w:rPr>
+    </w:pPr>
+    <w:r>
+      <w:rPr>
+        <w:b/>
+      </w:rPr>
+      <w:tab/>
+      <w:t>Matched Pairs</w:t>
+    </w:r>
+    <w:r>
+      <w:rPr>
+        <w:b/>
+      </w:rPr>
+      <w:t xml:space="preserve"> – </w:t>
+    </w:r>
+    <w:proofErr w:type="spellStart"/>
+    <w:r>
+      <w:rPr>
+        <w:b/>
+      </w:rPr>
+      <w:t>Pickleball</w:t>
+    </w:r>
+    <w:proofErr w:type="spellEnd"/>
+    <w:r>
+      <w:rPr>
+        <w:b/>
+      </w:rPr>
+      <w:t xml:space="preserve"> reliability scores</w:t>
+    </w:r>
+  </w:p>
+</w:hdr>
+</file>
+
 <file path=word/numbering.xml><?xml version="1.0" encoding="utf-8"?>
-<w:numbering xmlns:w="http://schemas.openxmlformats.org/wordprocessingml/2006/main">
-  <w:abstractNum w:abstractNumId="990">
+<w:numbering xmlns:wpc="http://schemas.microsoft.com/office/word/2010/wordprocessingCanvas" xmlns:cx="http://schemas.microsoft.com/office/drawing/2014/chartex" xmlns:cx1="http://schemas.microsoft.com/office/drawing/2015/9/8/chartex" xmlns:mc="http://schemas.openxmlformats.org/markup-compatibility/2006" xmlns:o="urn:schemas-microsoft-com:office:office" xmlns:r="http://schemas.openxmlformats.org/officeDocument/2006/relationships" xmlns:m="http://schemas.openxmlformats.org/officeDocument/2006/math" xmlns:v="urn:schemas-microsoft-com:vml" xmlns:wp14="http://schemas.microsoft.com/office/word/2010/wordprocessingDrawing" xmlns:wp="http://schemas.openxmlformats.org/drawingml/2006/wordprocessingDrawing" xmlns:w10="urn:schemas-microsoft-com:office:word" xmlns:w="http://schemas.openxmlformats.org/wordprocessingml/2006/main" xmlns:w14="http://schemas.microsoft.com/office/word/2010/wordml" xmlns:w15="http://schemas.microsoft.com/office/word/2012/wordml" xmlns:w16se="http://schemas.microsoft.com/office/word/2015/wordml/symex" xmlns:wpg="http://schemas.microsoft.com/office/word/2010/wordprocessingGroup" xmlns:wpi="http://schemas.microsoft.com/office/word/2010/wordprocessingInk" xmlns:wne="http://schemas.microsoft.com/office/word/2006/wordml" xmlns:wps="http://schemas.microsoft.com/office/word/2010/wordprocessingShape" mc:Ignorable="w14 w15 w16se wp14">
+  <w:abstractNum w:abstractNumId="0" w15:restartNumberingAfterBreak="0">
     <w:nsid w:val="0000A990"/>
     <w:multiLevelType w:val="multilevel"/>
+    <w:tmpl w:val="960E23BE"/>
     <w:lvl w:ilvl="0">
       <w:numFmt w:val="bullet"/>
       <w:lvlText w:val=" "/>
@@ -535,16 +1220,103 @@
       </w:pPr>
     </w:lvl>
   </w:abstractNum>
-  <w:abstractNum w:abstractNumId="99821">
+  <w:abstractNum w:abstractNumId="1" w15:restartNumberingAfterBreak="0">
+    <w:nsid w:val="00A99411"/>
+    <w:multiLevelType w:val="multilevel"/>
+    <w:tmpl w:val="DCB48CA8"/>
+    <w:lvl w:ilvl="0">
+      <w:start w:val="1"/>
+      <w:numFmt w:val="decimal"/>
+      <w:lvlText w:val="%1."/>
+      <w:lvlJc w:val="left"/>
+      <w:pPr>
+        <w:ind w:left="720" w:hanging="360"/>
+      </w:pPr>
+    </w:lvl>
+    <w:lvl w:ilvl="1">
+      <w:start w:val="1"/>
+      <w:numFmt w:val="decimal"/>
+      <w:lvlText w:val="%2."/>
+      <w:lvlJc w:val="left"/>
+      <w:pPr>
+        <w:ind w:left="1440" w:hanging="360"/>
+      </w:pPr>
+    </w:lvl>
+    <w:lvl w:ilvl="2">
+      <w:start w:val="1"/>
+      <w:numFmt w:val="decimal"/>
+      <w:lvlText w:val="%3."/>
+      <w:lvlJc w:val="left"/>
+      <w:pPr>
+        <w:ind w:left="2160" w:hanging="360"/>
+      </w:pPr>
+    </w:lvl>
+    <w:lvl w:ilvl="3">
+      <w:start w:val="1"/>
+      <w:numFmt w:val="decimal"/>
+      <w:lvlText w:val="%4."/>
+      <w:lvlJc w:val="left"/>
+      <w:pPr>
+        <w:ind w:left="2880" w:hanging="360"/>
+      </w:pPr>
+    </w:lvl>
+    <w:lvl w:ilvl="4">
+      <w:start w:val="1"/>
+      <w:numFmt w:val="decimal"/>
+      <w:lvlText w:val="%5."/>
+      <w:lvlJc w:val="left"/>
+      <w:pPr>
+        <w:ind w:left="3600" w:hanging="360"/>
+      </w:pPr>
+    </w:lvl>
+    <w:lvl w:ilvl="5">
+      <w:start w:val="1"/>
+      <w:numFmt w:val="decimal"/>
+      <w:lvlText w:val="%6."/>
+      <w:lvlJc w:val="left"/>
+      <w:pPr>
+        <w:ind w:left="4320" w:hanging="360"/>
+      </w:pPr>
+    </w:lvl>
+    <w:lvl w:ilvl="6">
+      <w:start w:val="1"/>
+      <w:numFmt w:val="decimal"/>
+      <w:lvlText w:val="%7."/>
+      <w:lvlJc w:val="left"/>
+      <w:pPr>
+        <w:ind w:left="5040" w:hanging="360"/>
+      </w:pPr>
+    </w:lvl>
+    <w:lvl w:ilvl="7">
+      <w:start w:val="1"/>
+      <w:numFmt w:val="decimal"/>
+      <w:lvlText w:val="%8."/>
+      <w:lvlJc w:val="left"/>
+      <w:pPr>
+        <w:ind w:left="5760" w:hanging="360"/>
+      </w:pPr>
+    </w:lvl>
+    <w:lvl w:ilvl="8">
+      <w:start w:val="1"/>
+      <w:numFmt w:val="decimal"/>
+      <w:lvlText w:val="%9."/>
+      <w:lvlJc w:val="left"/>
+      <w:pPr>
+        <w:ind w:left="6480" w:hanging="360"/>
+      </w:pPr>
+    </w:lvl>
+  </w:abstractNum>
+  <w:abstractNum w:abstractNumId="2" w15:restartNumberingAfterBreak="0">
     <w:nsid w:val="00A99821"/>
     <w:multiLevelType w:val="multilevel"/>
+    <w:tmpl w:val="7578D668"/>
     <w:lvl w:ilvl="0">
       <w:start w:val="1"/>
       <w:numFmt w:val="upperLetter"/>
       <w:lvlText w:val="%1)"/>
       <w:lvlJc w:val="left"/>
       <w:pPr>
-        <w:ind w:left="720" w:hanging="360"/>
+        <w:ind w:left="1080" w:hanging="360"/>
       </w:pPr>
     </w:lvl>
     <w:lvl w:ilvl="1">
@@ -553,7 +1325,7 @@
       <w:lvlText w:val="%2)"/>
       <w:lvlJc w:val="left"/>
       <w:pPr>
-        <w:ind w:left="1440" w:hanging="360"/>
+        <w:ind w:left="1800" w:hanging="360"/>
       </w:pPr>
     </w:lvl>
     <w:lvl w:ilvl="2">
@@ -562,7 +1334,7 @@
       <w:lvlText w:val="%3)"/>
       <w:lvlJc w:val="left"/>
       <w:pPr>
-        <w:ind w:left="2160" w:hanging="360"/>
+        <w:ind w:left="2520" w:hanging="360"/>
       </w:pPr>
     </w:lvl>
     <w:lvl w:ilvl="3">
@@ -571,7 +1343,7 @@
       <w:lvlText w:val="%4)"/>
       <w:lvlJc w:val="left"/>
       <w:pPr>
-        <w:ind w:left="2880" w:hanging="360"/>
+        <w:ind w:left="3240" w:hanging="360"/>
       </w:pPr>
     </w:lvl>
     <w:lvl w:ilvl="4">
@@ -580,7 +1352,7 @@
       <w:lvlText w:val="%5)"/>
       <w:lvlJc w:val="left"/>
       <w:pPr>
-        <w:ind w:left="3600" w:hanging="360"/>
+        <w:ind w:left="3960" w:hanging="360"/>
       </w:pPr>
     </w:lvl>
     <w:lvl w:ilvl="5">
@@ -589,7 +1361,7 @@
       <w:lvlText w:val="%6)"/>
       <w:lvlJc w:val="left"/>
       <w:pPr>
-        <w:ind w:left="4320" w:hanging="360"/>
+        <w:ind w:left="4680" w:hanging="360"/>
       </w:pPr>
     </w:lvl>
     <w:lvl w:ilvl="6">
@@ -598,7 +1370,7 @@
       <w:lvlText w:val="%7)"/>
       <w:lvlJc w:val="left"/>
       <w:pPr>
-        <w:ind w:left="5040" w:hanging="360"/>
+        <w:ind w:left="5400" w:hanging="360"/>
       </w:pPr>
     </w:lvl>
     <w:lvl w:ilvl="7">
@@ -607,7 +1379,7 @@
       <w:lvlText w:val="%8)"/>
       <w:lvlJc w:val="left"/>
       <w:pPr>
-        <w:ind w:left="5760" w:hanging="360"/>
+        <w:ind w:left="6120" w:hanging="360"/>
       </w:pPr>
     </w:lvl>
     <w:lvl w:ilvl="8">
@@ -616,41 +1388,44 @@
       <w:lvlText w:val="%9)"/>
       <w:lvlJc w:val="left"/>
       <w:pPr>
-        <w:ind w:left="6480" w:hanging="360"/>
+        <w:ind w:left="6840" w:hanging="360"/>
       </w:pPr>
     </w:lvl>
   </w:abstractNum>
-  <w:abstractNum w:abstractNumId="99411">
-    <w:nsid w:val="00A99411"/>
-    <w:multiLevelType w:val="multilevel"/>
-    <w:lvl w:ilvl="0">
-      <w:start w:val="1"/>
+  <w:abstractNum w:abstractNumId="3" w15:restartNumberingAfterBreak="0">
+    <w:nsid w:val="48454BB1"/>
+    <w:multiLevelType w:val="hybridMultilevel"/>
+    <w:tmpl w:val="8D580BC2"/>
+    <w:lvl w:ilvl="0" w:tplc="0409000F">
       <w:numFmt w:val="decimal"/>
       <w:lvlText w:val="%1."/>
       <w:lvlJc w:val="left"/>
       <w:pPr>
         <w:ind w:left="720" w:hanging="360"/>
       </w:pPr>
-    </w:lvl>
-    <w:lvl w:ilvl="1">
-      <w:start w:val="1"/>
-      <w:numFmt w:val="decimal"/>
+      <w:rPr>
+        <w:rFonts w:hint="default"/>
+      </w:rPr>
+    </w:lvl>
+    <w:lvl w:ilvl="1" w:tplc="04090019">
+      <w:start w:val="1"/>
+      <w:numFmt w:val="lowerLetter"/>
       <w:lvlText w:val="%2."/>
       <w:lvlJc w:val="left"/>
       <w:pPr>
         <w:ind w:left="1440" w:hanging="360"/>
       </w:pPr>
     </w:lvl>
-    <w:lvl w:ilvl="2">
-      <w:start w:val="1"/>
-      <w:numFmt w:val="decimal"/>
+    <w:lvl w:ilvl="2" w:tplc="0409001B" w:tentative="1">
+      <w:start w:val="1"/>
+      <w:numFmt w:val="lowerRoman"/>
       <w:lvlText w:val="%3."/>
-      <w:lvlJc w:val="left"/>
-      <w:pPr>
-        <w:ind w:left="2160" w:hanging="360"/>
-      </w:pPr>
-    </w:lvl>
-    <w:lvl w:ilvl="3">
+      <w:lvlJc w:val="right"/>
+      <w:pPr>
+        <w:ind w:left="2160" w:hanging="180"/>
+      </w:pPr>
+    </w:lvl>
+    <w:lvl w:ilvl="3" w:tplc="0409000F" w:tentative="1">
       <w:start w:val="1"/>
       <w:numFmt w:val="decimal"/>
       <w:lvlText w:val="%4."/>
@@ -659,25 +1434,25 @@
         <w:ind w:left="2880" w:hanging="360"/>
       </w:pPr>
     </w:lvl>
-    <w:lvl w:ilvl="4">
-      <w:start w:val="1"/>
-      <w:numFmt w:val="decimal"/>
+    <w:lvl w:ilvl="4" w:tplc="04090019" w:tentative="1">
+      <w:start w:val="1"/>
+      <w:numFmt w:val="lowerLetter"/>
       <w:lvlText w:val="%5."/>
       <w:lvlJc w:val="left"/>
       <w:pPr>
         <w:ind w:left="3600" w:hanging="360"/>
       </w:pPr>
     </w:lvl>
-    <w:lvl w:ilvl="5">
-      <w:start w:val="1"/>
-      <w:numFmt w:val="decimal"/>
+    <w:lvl w:ilvl="5" w:tplc="0409001B" w:tentative="1">
+      <w:start w:val="1"/>
+      <w:numFmt w:val="lowerRoman"/>
       <w:lvlText w:val="%6."/>
-      <w:lvlJc w:val="left"/>
-      <w:pPr>
-        <w:ind w:left="4320" w:hanging="360"/>
-      </w:pPr>
-    </w:lvl>
-    <w:lvl w:ilvl="6">
+      <w:lvlJc w:val="right"/>
+      <w:pPr>
+        <w:ind w:left="4320" w:hanging="180"/>
+      </w:pPr>
+    </w:lvl>
+    <w:lvl w:ilvl="6" w:tplc="0409000F" w:tentative="1">
       <w:start w:val="1"/>
       <w:numFmt w:val="decimal"/>
       <w:lvlText w:val="%7."/>
@@ -686,30 +1461,208 @@
         <w:ind w:left="5040" w:hanging="360"/>
       </w:pPr>
     </w:lvl>
-    <w:lvl w:ilvl="7">
+    <w:lvl w:ilvl="7" w:tplc="04090019" w:tentative="1">
+      <w:start w:val="1"/>
+      <w:numFmt w:val="lowerLetter"/>
+      <w:lvlText w:val="%8."/>
+      <w:lvlJc w:val="left"/>
+      <w:pPr>
+        <w:ind w:left="5760" w:hanging="360"/>
+      </w:pPr>
+    </w:lvl>
+    <w:lvl w:ilvl="8" w:tplc="0409001B" w:tentative="1">
+      <w:start w:val="1"/>
+      <w:numFmt w:val="lowerRoman"/>
+      <w:lvlText w:val="%9."/>
+      <w:lvlJc w:val="right"/>
+      <w:pPr>
+        <w:ind w:left="6480" w:hanging="180"/>
+      </w:pPr>
+    </w:lvl>
+  </w:abstractNum>
+  <w:abstractNum w:abstractNumId="4" w15:restartNumberingAfterBreak="0">
+    <w:nsid w:val="694C6253"/>
+    <w:multiLevelType w:val="hybridMultilevel"/>
+    <w:tmpl w:val="371EDF36"/>
+    <w:lvl w:ilvl="0" w:tplc="0409000F">
       <w:start w:val="1"/>
       <w:numFmt w:val="decimal"/>
+      <w:lvlText w:val="%1."/>
+      <w:lvlJc w:val="left"/>
+      <w:pPr>
+        <w:ind w:left="720" w:hanging="360"/>
+      </w:pPr>
+      <w:rPr>
+        <w:rFonts w:hint="default"/>
+      </w:rPr>
+    </w:lvl>
+    <w:lvl w:ilvl="1" w:tplc="04090019" w:tentative="1">
+      <w:start w:val="1"/>
+      <w:numFmt w:val="lowerLetter"/>
+      <w:lvlText w:val="%2."/>
+      <w:lvlJc w:val="left"/>
+      <w:pPr>
+        <w:ind w:left="1440" w:hanging="360"/>
+      </w:pPr>
+    </w:lvl>
+    <w:lvl w:ilvl="2" w:tplc="0409001B" w:tentative="1">
+      <w:start w:val="1"/>
+      <w:numFmt w:val="lowerRoman"/>
+      <w:lvlText w:val="%3."/>
+      <w:lvlJc w:val="right"/>
+      <w:pPr>
+        <w:ind w:left="2160" w:hanging="180"/>
+      </w:pPr>
+    </w:lvl>
+    <w:lvl w:ilvl="3" w:tplc="0409000F" w:tentative="1">
+      <w:start w:val="1"/>
+      <w:numFmt w:val="decimal"/>
+      <w:lvlText w:val="%4."/>
+      <w:lvlJc w:val="left"/>
+      <w:pPr>
+        <w:ind w:left="2880" w:hanging="360"/>
+      </w:pPr>
+    </w:lvl>
+    <w:lvl w:ilvl="4" w:tplc="04090019" w:tentative="1">
+      <w:start w:val="1"/>
+      <w:numFmt w:val="lowerLetter"/>
+      <w:lvlText w:val="%5."/>
+      <w:lvlJc w:val="left"/>
+      <w:pPr>
+        <w:ind w:left="3600" w:hanging="360"/>
+      </w:pPr>
+    </w:lvl>
+    <w:lvl w:ilvl="5" w:tplc="0409001B" w:tentative="1">
+      <w:start w:val="1"/>
+      <w:numFmt w:val="lowerRoman"/>
+      <w:lvlText w:val="%6."/>
+      <w:lvlJc w:val="right"/>
+      <w:pPr>
+        <w:ind w:left="4320" w:hanging="180"/>
+      </w:pPr>
+    </w:lvl>
+    <w:lvl w:ilvl="6" w:tplc="0409000F" w:tentative="1">
+      <w:start w:val="1"/>
+      <w:numFmt w:val="decimal"/>
+      <w:lvlText w:val="%7."/>
+      <w:lvlJc w:val="left"/>
+      <w:pPr>
+        <w:ind w:left="5040" w:hanging="360"/>
+      </w:pPr>
+    </w:lvl>
+    <w:lvl w:ilvl="7" w:tplc="04090019" w:tentative="1">
+      <w:start w:val="1"/>
+      <w:numFmt w:val="lowerLetter"/>
       <w:lvlText w:val="%8."/>
       <w:lvlJc w:val="left"/>
       <w:pPr>
         <w:ind w:left="5760" w:hanging="360"/>
       </w:pPr>
     </w:lvl>
-    <w:lvl w:ilvl="8">
+    <w:lvl w:ilvl="8" w:tplc="0409001B" w:tentative="1">
+      <w:start w:val="1"/>
+      <w:numFmt w:val="lowerRoman"/>
+      <w:lvlText w:val="%9."/>
+      <w:lvlJc w:val="right"/>
+      <w:pPr>
+        <w:ind w:left="6480" w:hanging="180"/>
+      </w:pPr>
+    </w:lvl>
+  </w:abstractNum>
+  <w:abstractNum w:abstractNumId="5" w15:restartNumberingAfterBreak="0">
+    <w:nsid w:val="6BD4741A"/>
+    <w:multiLevelType w:val="hybridMultilevel"/>
+    <w:tmpl w:val="2FEA8EA6"/>
+    <w:lvl w:ilvl="0" w:tplc="01A443D8">
       <w:start w:val="1"/>
       <w:numFmt w:val="decimal"/>
+      <w:lvlText w:val="%1."/>
+      <w:lvlJc w:val="left"/>
+      <w:pPr>
+        <w:ind w:left="1080" w:hanging="360"/>
+      </w:pPr>
+      <w:rPr>
+        <w:rFonts w:hint="default"/>
+      </w:rPr>
+    </w:lvl>
+    <w:lvl w:ilvl="1" w:tplc="04090019" w:tentative="1">
+      <w:start w:val="1"/>
+      <w:numFmt w:val="lowerLetter"/>
+      <w:lvlText w:val="%2."/>
+      <w:lvlJc w:val="left"/>
+      <w:pPr>
+        <w:ind w:left="1800" w:hanging="360"/>
+      </w:pPr>
+    </w:lvl>
+    <w:lvl w:ilvl="2" w:tplc="0409001B" w:tentative="1">
+      <w:start w:val="1"/>
+      <w:numFmt w:val="lowerRoman"/>
+      <w:lvlText w:val="%3."/>
+      <w:lvlJc w:val="right"/>
+      <w:pPr>
+        <w:ind w:left="2520" w:hanging="180"/>
+      </w:pPr>
+    </w:lvl>
+    <w:lvl w:ilvl="3" w:tplc="0409000F" w:tentative="1">
+      <w:start w:val="1"/>
+      <w:numFmt w:val="decimal"/>
+      <w:lvlText w:val="%4."/>
+      <w:lvlJc w:val="left"/>
+      <w:pPr>
+        <w:ind w:left="3240" w:hanging="360"/>
+      </w:pPr>
+    </w:lvl>
+    <w:lvl w:ilvl="4" w:tplc="04090019" w:tentative="1">
+      <w:start w:val="1"/>
+      <w:numFmt w:val="lowerLetter"/>
+      <w:lvlText w:val="%5."/>
+      <w:lvlJc w:val="left"/>
+      <w:pPr>
+        <w:ind w:left="3960" w:hanging="360"/>
+      </w:pPr>
+    </w:lvl>
+    <w:lvl w:ilvl="5" w:tplc="0409001B" w:tentative="1">
+      <w:start w:val="1"/>
+      <w:numFmt w:val="lowerRoman"/>
+      <w:lvlText w:val="%6."/>
+      <w:lvlJc w:val="right"/>
+      <w:pPr>
+        <w:ind w:left="4680" w:hanging="180"/>
+      </w:pPr>
+    </w:lvl>
+    <w:lvl w:ilvl="6" w:tplc="0409000F" w:tentative="1">
+      <w:start w:val="1"/>
+      <w:numFmt w:val="decimal"/>
+      <w:lvlText w:val="%7."/>
+      <w:lvlJc w:val="left"/>
+      <w:pPr>
+        <w:ind w:left="5400" w:hanging="360"/>
+      </w:pPr>
+    </w:lvl>
+    <w:lvl w:ilvl="7" w:tplc="04090019" w:tentative="1">
+      <w:start w:val="1"/>
+      <w:numFmt w:val="lowerLetter"/>
+      <w:lvlText w:val="%8."/>
+      <w:lvlJc w:val="left"/>
+      <w:pPr>
+        <w:ind w:left="6120" w:hanging="360"/>
+      </w:pPr>
+    </w:lvl>
+    <w:lvl w:ilvl="8" w:tplc="0409001B" w:tentative="1">
+      <w:start w:val="1"/>
+      <w:numFmt w:val="lowerRoman"/>
       <w:lvlText w:val="%9."/>
-      <w:lvlJc w:val="left"/>
-      <w:pPr>
-        <w:ind w:left="6480" w:hanging="360"/>
+      <w:lvlJc w:val="right"/>
+      <w:pPr>
+        <w:ind w:left="6840" w:hanging="180"/>
       </w:pPr>
     </w:lvl>
   </w:abstractNum>
-  <w:num w:numId="1000">
-    <w:abstractNumId w:val="990"/>
+  <w:num w:numId="1">
+    <w:abstractNumId w:val="0"/>
   </w:num>
-  <w:num w:numId="1001">
-    <w:abstractNumId w:val="99821"/>
+  <w:num w:numId="2">
+    <w:abstractNumId w:val="2"/>
     <w:lvlOverride w:ilvl="0">
       <w:startOverride w:val="1"/>
     </w:lvlOverride>
@@ -738,8 +1691,8 @@
       <w:startOverride w:val="1"/>
     </w:lvlOverride>
   </w:num>
-  <w:num w:numId="1002">
-    <w:abstractNumId w:val="99821"/>
+  <w:num w:numId="3">
+    <w:abstractNumId w:val="2"/>
     <w:lvlOverride w:ilvl="0">
       <w:startOverride w:val="1"/>
     </w:lvlOverride>
@@ -768,8 +1721,8 @@
       <w:startOverride w:val="1"/>
     </w:lvlOverride>
   </w:num>
-  <w:num w:numId="1003">
-    <w:abstractNumId w:val="99411"/>
+  <w:num w:numId="4">
+    <w:abstractNumId w:val="1"/>
     <w:lvlOverride w:ilvl="0">
       <w:startOverride w:val="1"/>
     </w:lvlOverride>
@@ -798,8 +1751,8 @@
       <w:startOverride w:val="1"/>
     </w:lvlOverride>
   </w:num>
-  <w:num w:numId="1004">
-    <w:abstractNumId w:val="99821"/>
+  <w:num w:numId="5">
+    <w:abstractNumId w:val="2"/>
     <w:lvlOverride w:ilvl="0">
       <w:startOverride w:val="1"/>
     </w:lvlOverride>
@@ -828,8 +1781,8 @@
       <w:startOverride w:val="1"/>
     </w:lvlOverride>
   </w:num>
-  <w:num w:numId="1005">
-    <w:abstractNumId w:val="99821"/>
+  <w:num w:numId="6">
+    <w:abstractNumId w:val="2"/>
     <w:lvlOverride w:ilvl="0">
       <w:startOverride w:val="1"/>
     </w:lvlOverride>
@@ -857,19 +1810,28 @@
     <w:lvlOverride w:ilvl="8">
       <w:startOverride w:val="1"/>
     </w:lvlOverride>
+  </w:num>
+  <w:num w:numId="7">
+    <w:abstractNumId w:val="3"/>
+  </w:num>
+  <w:num w:numId="8">
+    <w:abstractNumId w:val="5"/>
+  </w:num>
+  <w:num w:numId="9">
+    <w:abstractNumId w:val="4"/>
   </w:num>
 </w:numbering>
 </file>
 
 <file path=word/styles.xml><?xml version="1.0" encoding="utf-8"?>
-<w:styles xmlns:r="http://schemas.openxmlformats.org/officeDocument/2006/relationships" xmlns:w="http://schemas.openxmlformats.org/wordprocessingml/2006/main">
+<w:styles xmlns:mc="http://schemas.openxmlformats.org/markup-compatibility/2006" xmlns:r="http://schemas.openxmlformats.org/officeDocument/2006/relationships" xmlns:w="http://schemas.openxmlformats.org/wordprocessingml/2006/main" xmlns:w14="http://schemas.microsoft.com/office/word/2010/wordml" xmlns:w15="http://schemas.microsoft.com/office/word/2012/wordml" xmlns:w16se="http://schemas.microsoft.com/office/word/2015/wordml/symex" mc:Ignorable="w14 w15 w16se">
   <w:docDefaults>
     <w:rPrDefault>
       <w:rPr>
-        <w:rFonts w:asciiTheme="minorHAnsi" w:cstheme="minorBidi" w:eastAsiaTheme="minorHAnsi" w:hAnsiTheme="minorHAnsi"/>
+        <w:rFonts w:asciiTheme="minorHAnsi" w:eastAsiaTheme="minorHAnsi" w:hAnsiTheme="minorHAnsi" w:cstheme="minorBidi"/>
         <w:sz w:val="24"/>
         <w:szCs w:val="24"/>
-        <w:lang w:bidi="ar-SA" w:eastAsia="en-US" w:val="en-US"/>
+        <w:lang w:val="en-US" w:eastAsia="en-US" w:bidi="ar-SA"/>
       </w:rPr>
     </w:rPrDefault>
     <w:pPrDefault>
@@ -878,164 +1840,333 @@
       </w:pPr>
     </w:pPrDefault>
   </w:docDefaults>
-  <w:latentStyles w:count="276" w:defLockedState="0" w:defQFormat="0" w:defSemiHidden="0" w:defUIPriority="0" w:defUnhideWhenUsed="0"/>
-  <w:style w:default="1" w:styleId="Normal" w:type="paragraph">
+  <w:latentStyles w:defLockedState="0" w:defUIPriority="0" w:defSemiHidden="0" w:defUnhideWhenUsed="0" w:defQFormat="0" w:count="371">
+    <w:lsdException w:name="index 1" w:semiHidden="1" w:unhideWhenUsed="1"/>
+    <w:lsdException w:name="index 7" w:semiHidden="1" w:unhideWhenUsed="1"/>
+    <w:lsdException w:name="index 8" w:semiHidden="1" w:unhideWhenUsed="1"/>
+    <w:lsdException w:name="index 9" w:semiHidden="1" w:unhideWhenUsed="1"/>
+    <w:lsdException w:name="toc 1" w:semiHidden="1" w:unhideWhenUsed="1"/>
+    <w:lsdException w:name="toc 2" w:semiHidden="1" w:unhideWhenUsed="1"/>
+    <w:lsdException w:name="toc 3" w:semiHidden="1" w:unhideWhenUsed="1"/>
+    <w:lsdException w:name="toc 4" w:semiHidden="1" w:unhideWhenUsed="1"/>
+    <w:lsdException w:name="toc 5" w:semiHidden="1" w:unhideWhenUsed="1"/>
+    <w:lsdException w:name="toc 6" w:semiHidden="1" w:unhideWhenUsed="1"/>
+    <w:lsdException w:name="toc 7" w:semiHidden="1" w:unhideWhenUsed="1"/>
+    <w:lsdException w:name="toc 8" w:semiHidden="1" w:unhideWhenUsed="1"/>
+    <w:lsdException w:name="toc 9" w:semiHidden="1" w:unhideWhenUsed="1"/>
+    <w:lsdException w:name="Normal Indent" w:semiHidden="1" w:unhideWhenUsed="1"/>
+    <w:lsdException w:name="footnote text" w:semiHidden="1" w:unhideWhenUsed="1"/>
+    <w:lsdException w:name="annotation text" w:semiHidden="1" w:unhideWhenUsed="1"/>
+    <w:lsdException w:name="header" w:semiHidden="1" w:unhideWhenUsed="1"/>
+    <w:lsdException w:name="footer" w:semiHidden="1" w:unhideWhenUsed="1"/>
+    <w:lsdException w:name="index heading" w:semiHidden="1" w:unhideWhenUsed="1"/>
+    <w:lsdException w:name="caption" w:semiHidden="1" w:unhideWhenUsed="1"/>
+    <w:lsdException w:name="table of figures" w:semiHidden="1" w:unhideWhenUsed="1"/>
+    <w:lsdException w:name="envelope address" w:semiHidden="1" w:unhideWhenUsed="1"/>
+    <w:lsdException w:name="envelope return" w:semiHidden="1" w:unhideWhenUsed="1"/>
+    <w:lsdException w:name="footnote reference" w:semiHidden="1" w:unhideWhenUsed="1"/>
+    <w:lsdException w:name="annotation reference" w:semiHidden="1" w:unhideWhenUsed="1"/>
+    <w:lsdException w:name="line number" w:semiHidden="1" w:unhideWhenUsed="1"/>
+    <w:lsdException w:name="page number" w:semiHidden="1" w:unhideWhenUsed="1"/>
+    <w:lsdException w:name="endnote reference" w:semiHidden="1" w:unhideWhenUsed="1"/>
+    <w:lsdException w:name="endnote text" w:semiHidden="1" w:unhideWhenUsed="1"/>
+    <w:lsdException w:name="table of authorities" w:semiHidden="1" w:unhideWhenUsed="1"/>
+    <w:lsdException w:name="macro" w:semiHidden="1" w:unhideWhenUsed="1"/>
+    <w:lsdException w:name="toa heading" w:semiHidden="1" w:unhideWhenUsed="1"/>
+    <w:lsdException w:name="List" w:semiHidden="1" w:unhideWhenUsed="1"/>
+    <w:lsdException w:name="List Bullet" w:semiHidden="1" w:unhideWhenUsed="1"/>
+    <w:lsdException w:name="List Number" w:semiHidden="1" w:unhideWhenUsed="1"/>
+    <w:lsdException w:name="List 2" w:semiHidden="1" w:unhideWhenUsed="1"/>
+    <w:lsdException w:name="List 3" w:semiHidden="1" w:unhideWhenUsed="1"/>
+    <w:lsdException w:name="List 4" w:semiHidden="1" w:unhideWhenUsed="1"/>
+    <w:lsdException w:name="List 5" w:semiHidden="1" w:unhideWhenUsed="1"/>
+    <w:lsdException w:name="List Bullet 2" w:semiHidden="1" w:unhideWhenUsed="1"/>
+    <w:lsdException w:name="List Bullet 3" w:semiHidden="1" w:unhideWhenUsed="1"/>
+    <w:lsdException w:name="List Bullet 4" w:semiHidden="1" w:unhideWhenUsed="1"/>
+    <w:lsdException w:name="List Bullet 5" w:semiHidden="1" w:unhideWhenUsed="1"/>
+    <w:lsdException w:name="List Number 3" w:semiHidden="1" w:unhideWhenUsed="1"/>
+    <w:lsdException w:name="List Number 4" w:semiHidden="1" w:unhideWhenUsed="1"/>
+    <w:lsdException w:name="Closing" w:semiHidden="1" w:unhideWhenUsed="1"/>
+    <w:lsdException w:name="Signature" w:semiHidden="1" w:unhideWhenUsed="1"/>
+    <w:lsdException w:name="Default Paragraph Font" w:semiHidden="1" w:unhideWhenUsed="1"/>
+    <w:lsdException w:name="Body Text" w:semiHidden="1" w:unhideWhenUsed="1"/>
+    <w:lsdException w:name="Body Text Indent" w:semiHidden="1" w:unhideWhenUsed="1"/>
+    <w:lsdException w:name="List Continue" w:semiHidden="1" w:unhideWhenUsed="1"/>
+    <w:lsdException w:name="List Continue 2" w:semiHidden="1" w:unhideWhenUsed="1"/>
+    <w:lsdException w:name="List Continue 3" w:semiHidden="1" w:unhideWhenUsed="1"/>
+    <w:lsdException w:name="List Continue 4" w:semiHidden="1" w:unhideWhenUsed="1"/>
+    <w:lsdException w:name="List Continue 5" w:semiHidden="1" w:unhideWhenUsed="1"/>
+    <w:lsdException w:name="Message Header" w:semiHidden="1" w:unhideWhenUsed="1"/>
+    <w:lsdException w:name="Salutation" w:semiHidden="1" w:unhideWhenUsed="1"/>
+    <w:lsdException w:name="Date" w:semiHidden="1" w:unhideWhenUsed="1"/>
+    <w:lsdException w:name="Body Text First Indent" w:semiHidden="1" w:unhideWhenUsed="1"/>
+    <w:lsdException w:name="Body Text First Indent 2" w:semiHidden="1" w:unhideWhenUsed="1"/>
+    <w:lsdException w:name="Note Heading" w:semiHidden="1" w:unhideWhenUsed="1"/>
+    <w:lsdException w:name="Body Text 2" w:semiHidden="1" w:unhideWhenUsed="1"/>
+    <w:lsdException w:name="Body Text 3" w:semiHidden="1" w:unhideWhenUsed="1"/>
+    <w:lsdException w:name="Body Text Indent 2" w:semiHidden="1" w:unhideWhenUsed="1"/>
+    <w:lsdException w:name="Document Map" w:semiHidden="1" w:unhideWhenUsed="1"/>
+    <w:lsdException w:name="Plain Text" w:semiHidden="1" w:unhideWhenUsed="1"/>
+    <w:lsdException w:name="E-mail Signature" w:semiHidden="1" w:unhideWhenUsed="1"/>
+    <w:lsdException w:name="HTML Top of Form" w:semiHidden="1" w:unhideWhenUsed="1"/>
+    <w:lsdException w:name="HTML Bottom of Form" w:semiHidden="1" w:unhideWhenUsed="1"/>
+    <w:lsdException w:name="Normal (Web)" w:semiHidden="1" w:unhideWhenUsed="1"/>
+    <w:lsdException w:name="HTML Acronym" w:semiHidden="1" w:unhideWhenUsed="1"/>
+    <w:lsdException w:name="HTML Address" w:semiHidden="1" w:unhideWhenUsed="1"/>
+    <w:lsdException w:name="HTML Cite" w:semiHidden="1" w:unhideWhenUsed="1"/>
+    <w:lsdException w:name="HTML Code" w:semiHidden="1" w:unhideWhenUsed="1"/>
+    <w:lsdException w:name="HTML Definition" w:semiHidden="1" w:unhideWhenUsed="1"/>
+    <w:lsdException w:name="HTML Keyboard" w:semiHidden="1" w:unhideWhenUsed="1"/>
+    <w:lsdException w:name="HTML Preformatted" w:semiHidden="1" w:unhideWhenUsed="1"/>
+    <w:lsdException w:name="HTML Sample" w:semiHidden="1" w:unhideWhenUsed="1"/>
+    <w:lsdException w:name="HTML Typewriter" w:semiHidden="1" w:unhideWhenUsed="1"/>
+    <w:lsdException w:name="HTML Variable" w:semiHidden="1" w:unhideWhenUsed="1"/>
+    <w:lsdException w:name="Normal Table" w:semiHidden="1" w:unhideWhenUsed="1"/>
+    <w:lsdException w:name="annotation subject" w:semiHidden="1" w:unhideWhenUsed="1"/>
+    <w:lsdException w:name="No List" w:semiHidden="1" w:unhideWhenUsed="1"/>
+    <w:lsdException w:name="Outline List 1" w:semiHidden="1" w:unhideWhenUsed="1"/>
+    <w:lsdException w:name="Outline List 2" w:semiHidden="1" w:unhideWhenUsed="1"/>
+    <w:lsdException w:name="Outline List 3" w:semiHidden="1" w:unhideWhenUsed="1"/>
+    <w:lsdException w:name="Table Simple 1" w:semiHidden="1" w:unhideWhenUsed="1"/>
+    <w:lsdException w:name="Table Simple 2" w:semiHidden="1" w:unhideWhenUsed="1"/>
+    <w:lsdException w:name="Table Simple 3" w:semiHidden="1" w:unhideWhenUsed="1"/>
+    <w:lsdException w:name="Table Classic 1" w:semiHidden="1" w:unhideWhenUsed="1"/>
+    <w:lsdException w:name="Table Classic 2" w:semiHidden="1" w:unhideWhenUsed="1"/>
+    <w:lsdException w:name="Table Classic 3" w:semiHidden="1" w:unhideWhenUsed="1"/>
+    <w:lsdException w:name="Table Classic 4" w:semiHidden="1" w:unhideWhenUsed="1"/>
+    <w:lsdException w:name="Table Colorful 1" w:semiHidden="1" w:unhideWhenUsed="1"/>
+    <w:lsdException w:name="Table Colorful 2" w:semiHidden="1" w:unhideWhenUsed="1"/>
+    <w:lsdException w:name="Table Colorful 3" w:semiHidden="1" w:unhideWhenUsed="1"/>
+    <w:lsdException w:name="Table Columns 1" w:semiHidden="1" w:unhideWhenUsed="1"/>
+    <w:lsdException w:name="Table Columns 2" w:semiHidden="1" w:unhideWhenUsed="1"/>
+    <w:lsdException w:name="Table Columns 3" w:semiHidden="1" w:unhideWhenUsed="1"/>
+    <w:lsdException w:name="Table Columns 4" w:semiHidden="1" w:unhideWhenUsed="1"/>
+    <w:lsdException w:name="Table Columns 5" w:semiHidden="1" w:unhideWhenUsed="1"/>
+    <w:lsdException w:name="Table Grid 1" w:semiHidden="1" w:unhideWhenUsed="1"/>
+    <w:lsdException w:name="Table Grid 2" w:semiHidden="1" w:unhideWhenUsed="1"/>
+    <w:lsdException w:name="Table Grid 3" w:semiHidden="1" w:unhideWhenUsed="1"/>
+    <w:lsdException w:name="Table Grid 4" w:semiHidden="1" w:unhideWhenUsed="1"/>
+    <w:lsdException w:name="Table Grid 5" w:semiHidden="1" w:unhideWhenUsed="1"/>
+    <w:lsdException w:name="Table Grid 6" w:semiHidden="1" w:unhideWhenUsed="1"/>
+    <w:lsdException w:name="Table Grid 7" w:semiHidden="1" w:unhideWhenUsed="1"/>
+    <w:lsdException w:name="Table Grid 8" w:semiHidden="1" w:unhideWhenUsed="1"/>
+    <w:lsdException w:name="Table List 1" w:semiHidden="1" w:unhideWhenUsed="1"/>
+    <w:lsdException w:name="Table List 2" w:semiHidden="1" w:unhideWhenUsed="1"/>
+    <w:lsdException w:name="Table List 3" w:semiHidden="1" w:unhideWhenUsed="1"/>
+    <w:lsdException w:name="Table List 4" w:semiHidden="1" w:unhideWhenUsed="1"/>
+    <w:lsdException w:name="Table List 5" w:semiHidden="1" w:unhideWhenUsed="1"/>
+    <w:lsdException w:name="Table List 6" w:semiHidden="1" w:unhideWhenUsed="1"/>
+    <w:lsdException w:name="Table List 7" w:semiHidden="1" w:unhideWhenUsed="1"/>
+    <w:lsdException w:name="Table List 8" w:semiHidden="1" w:unhideWhenUsed="1"/>
+    <w:lsdException w:name="Table 3D effects 1" w:semiHidden="1" w:unhideWhenUsed="1"/>
+    <w:lsdException w:name="Table 3D effects 2" w:semiHidden="1" w:unhideWhenUsed="1"/>
+    <w:lsdException w:name="Table 3D effects 3" w:semiHidden="1" w:unhideWhenUsed="1"/>
+    <w:lsdException w:name="Table Contemporary" w:semiHidden="1" w:unhideWhenUsed="1"/>
+    <w:lsdException w:name="Table Elegant" w:semiHidden="1" w:unhideWhenUsed="1"/>
+    <w:lsdException w:name="Table Professional" w:semiHidden="1" w:unhideWhenUsed="1"/>
+    <w:lsdException w:name="Table Subtle 1" w:semiHidden="1" w:unhideWhenUsed="1"/>
+    <w:lsdException w:name="Table Subtle 2" w:semiHidden="1" w:unhideWhenUsed="1"/>
+    <w:lsdException w:name="Table Web 1" w:semiHidden="1" w:unhideWhenUsed="1"/>
+    <w:lsdException w:name="Table Web 2" w:semiHidden="1" w:unhideWhenUsed="1"/>
+    <w:lsdException w:name="Table Web 3" w:semiHidden="1" w:unhideWhenUsed="1"/>
+    <w:lsdException w:name="Balloon Text" w:semiHidden="1" w:unhideWhenUsed="1"/>
+    <w:lsdException w:name="Table Theme" w:semiHidden="1" w:unhideWhenUsed="1"/>
+    <w:lsdException w:name="Placeholder Text" w:semiHidden="1"/>
+    <w:lsdException w:name="Light Shading"/>
+    <w:lsdException w:name="Light List"/>
+    <w:lsdException w:name="Light Grid"/>
+    <w:lsdException w:name="Medium Shading 1"/>
+    <w:lsdException w:name="Medium Shading 2"/>
+    <w:lsdException w:name="Medium List 1"/>
+    <w:lsdException w:name="Medium List 2"/>
+    <w:lsdException w:name="Light Shading Accent 1"/>
+    <w:lsdException w:name="Light List Accent 1"/>
+    <w:lsdException w:name="Light Grid Accent 1"/>
+    <w:lsdException w:name="Medium Shading 1 Accent 1"/>
+    <w:lsdException w:name="Medium Shading 2 Accent 1"/>
+    <w:lsdException w:name="Medium List 1 Accent 1"/>
+    <w:lsdException w:name="Revision" w:semiHidden="1"/>
+    <w:lsdException w:name="Medium List 2 Accent 1"/>
+    <w:lsdException w:name="Medium Grid 1 Accent 1"/>
+    <w:lsdException w:name="Medium Grid 2 Accent 1"/>
+    <w:lsdException w:name="Medium Grid 3 Accent 1"/>
+    <w:lsdException w:name="Dark List Accent 1"/>
+    <w:lsdException w:name="Colorful Shading Accent 1"/>
+    <w:lsdException w:name="Colorful List Accent 1"/>
+    <w:lsdException w:name="Colorful Grid Accent 1"/>
+    <w:lsdException w:name="Light Shading Accent 2"/>
+    <w:lsdException w:name="Light List Accent 2"/>
+    <w:lsdException w:name="Light Grid Accent 2"/>
+    <w:lsdException w:name="Medium Shading 1 Accent 2"/>
+    <w:lsdException w:name="Medium Shading 2 Accent 2"/>
+    <w:lsdException w:name="Medium List 1 Accent 2"/>
+    <w:lsdException w:name="Medium List 2 Accent 2"/>
+    <w:lsdException w:name="Medium Grid 1 Accent 2"/>
+    <w:lsdException w:name="Medium Grid 2 Accent 2"/>
+    <w:lsdException w:name="Medium Grid 3 Accent 2"/>
+    <w:lsdException w:name="Dark List Accent 2"/>
+    <w:lsdException w:name="Colorful Shading Accent 2"/>
+    <w:lsdException w:name="Colorful List Accent 2"/>
+    <w:lsdException w:name="Colorful Grid Accent 2"/>
+    <w:lsdException w:name="Light Shading Accent 3"/>
+    <w:lsdException w:name="Light List Accent 3"/>
+    <w:lsdException w:name="Light Grid Accent 3"/>
+    <w:lsdException w:name="Medium Shading 1 Accent 3"/>
+    <w:lsdException w:name="Medium Shading 2 Accent 3"/>
+    <w:lsdException w:name="Medium List 1 Accent 3"/>
+    <w:lsdException w:name="Medium List 2 Accent 3"/>
+    <w:lsdException w:name="Medium Grid 1 Accent 3"/>
+    <w:lsdException w:name="Medium Grid 2 Accent 3"/>
+    <w:lsdException w:name="Medium Grid 3 Accent 3"/>
+    <w:lsdException w:name="Dark List Accent 3"/>
+    <w:lsdException w:name="Colorful Shading Accent 3"/>
+    <w:lsdException w:name="Colorful List Accent 3"/>
+    <w:lsdException w:name="Colorful Grid Accent 3"/>
+    <w:lsdException w:name="Light Shading Accent 4"/>
+    <w:lsdException w:name="Light List Accent 4"/>
+    <w:lsdException w:name="Light Grid Accent 4"/>
+    <w:lsdException w:name="Medium Shading 1 Accent 4"/>
+    <w:lsdException w:name="Medium Shading 2 Accent 4"/>
+    <w:lsdException w:name="Medium List 1 Accent 4"/>
+    <w:lsdException w:name="Medium List 2 Accent 4"/>
+    <w:lsdException w:name="Medium Grid 1 Accent 4"/>
+    <w:lsdException w:name="Medium Grid 2 Accent 4"/>
+    <w:lsdException w:name="Medium Grid 3 Accent 4"/>
+    <w:lsdException w:name="Dark List Accent 4"/>
+    <w:lsdException w:name="Colorful Shading Accent 4"/>
+    <w:lsdException w:name="Colorful List Accent 4"/>
+    <w:lsdException w:name="Colorful Grid Accent 4"/>
+    <w:lsdException w:name="Light Shading Accent 5"/>
+    <w:lsdException w:name="Light List Accent 5"/>
+    <w:lsdException w:name="Light Grid Accent 5"/>
+    <w:lsdException w:name="Medium Shading 1 Accent 5"/>
+    <w:lsdException w:name="Medium Shading 2 Accent 5"/>
+    <w:lsdException w:name="Medium List 1 Accent 5"/>
+    <w:lsdException w:name="Medium List 2 Accent 5"/>
+    <w:lsdException w:name="Medium Grid 1 Accent 5"/>
+    <w:lsdException w:name="Medium Grid 2 Accent 5"/>
+    <w:lsdException w:name="Medium Grid 3 Accent 5"/>
+    <w:lsdException w:name="Dark List Accent 5"/>
+    <w:lsdException w:name="Colorful Shading Accent 5"/>
+    <w:lsdException w:name="Colorful List Accent 5"/>
+    <w:lsdException w:name="Colorful Grid Accent 5"/>
+    <w:lsdException w:name="Light Shading Accent 6"/>
+    <w:lsdException w:name="Light List Accent 6"/>
+    <w:lsdException w:name="Light Grid Accent 6"/>
+    <w:lsdException w:name="Medium Shading 1 Accent 6"/>
+    <w:lsdException w:name="Medium Shading 2 Accent 6"/>
+    <w:lsdException w:name="Medium List 1 Accent 6"/>
+    <w:lsdException w:name="Medium List 2 Accent 6"/>
+    <w:lsdException w:name="Medium Grid 1 Accent 6"/>
+    <w:lsdException w:name="Medium Grid 2 Accent 6"/>
+    <w:lsdException w:name="Medium Grid 3 Accent 6"/>
+    <w:lsdException w:name="Dark List Accent 6"/>
+    <w:lsdException w:name="Colorful Shading Accent 6"/>
+    <w:lsdException w:name="Colorful List Accent 6"/>
+    <w:lsdException w:name="Colorful Grid Accent 6"/>
+    <w:lsdException w:name="Bibliography" w:semiHidden="1" w:unhideWhenUsed="1"/>
+    <w:lsdException w:name="TOC Heading" w:semiHidden="1" w:unhideWhenUsed="1"/>
+    <w:lsdException w:name="Grid Table 4" w:uiPriority="49"/>
+    <w:lsdException w:name="Grid Table 5 Dark" w:uiPriority="50"/>
+    <w:lsdException w:name="Grid Table 6 Colorful" w:uiPriority="51"/>
+    <w:lsdException w:name="Grid Table 7 Colorful" w:uiPriority="52"/>
+    <w:lsdException w:name="Grid Table 1 Light Accent 1" w:uiPriority="46"/>
+    <w:lsdException w:name="Grid Table 2 Accent 1" w:uiPriority="47"/>
+    <w:lsdException w:name="Grid Table 3 Accent 1" w:uiPriority="48"/>
+    <w:lsdException w:name="Grid Table 4 Accent 1" w:uiPriority="49"/>
+    <w:lsdException w:name="Grid Table 5 Dark Accent 1" w:uiPriority="50"/>
+    <w:lsdException w:name="Grid Table 6 Colorful Accent 1" w:uiPriority="51"/>
+    <w:lsdException w:name="Grid Table 7 Colorful Accent 1" w:uiPriority="52"/>
+    <w:lsdException w:name="Grid Table 1 Light Accent 2" w:uiPriority="46"/>
+    <w:lsdException w:name="Grid Table 2 Accent 2" w:uiPriority="47"/>
+    <w:lsdException w:name="Grid Table 3 Accent 2" w:uiPriority="48"/>
+    <w:lsdException w:name="Grid Table 4 Accent 2" w:uiPriority="49"/>
+    <w:lsdException w:name="Grid Table 5 Dark Accent 2" w:uiPriority="50"/>
+    <w:lsdException w:name="Grid Table 6 Colorful Accent 2" w:uiPriority="51"/>
+    <w:lsdException w:name="Grid Table 7 Colorful Accent 2" w:uiPriority="52"/>
+    <w:lsdException w:name="Grid Table 1 Light Accent 3" w:uiPriority="46"/>
+    <w:lsdException w:name="Grid Table 2 Accent 3" w:uiPriority="47"/>
+    <w:lsdException w:name="Grid Table 3 Accent 3" w:uiPriority="48"/>
+    <w:lsdException w:name="Grid Table 4 Accent 3" w:uiPriority="49"/>
+    <w:lsdException w:name="Grid Table 5 Dark Accent 3" w:uiPriority="50"/>
+    <w:lsdException w:name="Grid Table 6 Colorful Accent 3" w:uiPriority="51"/>
+    <w:lsdException w:name="Grid Table 7 Colorful Accent 3" w:uiPriority="52"/>
+    <w:lsdException w:name="Grid Table 1 Light Accent 4" w:uiPriority="46"/>
+    <w:lsdException w:name="Grid Table 2 Accent 4" w:uiPriority="47"/>
+    <w:lsdException w:name="Grid Table 3 Accent 4" w:uiPriority="48"/>
+    <w:lsdException w:name="Grid Table 4 Accent 4" w:uiPriority="49"/>
+    <w:lsdException w:name="Grid Table 5 Dark Accent 4" w:uiPriority="50"/>
+    <w:lsdException w:name="Grid Table 6 Colorful Accent 4" w:uiPriority="51"/>
+    <w:lsdException w:name="Grid Table 7 Colorful Accent 4" w:uiPriority="52"/>
+    <w:lsdException w:name="Grid Table 1 Light Accent 5" w:uiPriority="46"/>
+    <w:lsdException w:name="Grid Table 2 Accent 5" w:uiPriority="47"/>
+    <w:lsdException w:name="Grid Table 3 Accent 5" w:uiPriority="48"/>
+    <w:lsdException w:name="Grid Table 4 Accent 5" w:uiPriority="49"/>
+    <w:lsdException w:name="Grid Table 5 Dark Accent 5" w:uiPriority="50"/>
+    <w:lsdException w:name="Grid Table 6 Colorful Accent 5" w:uiPriority="51"/>
+    <w:lsdException w:name="Grid Table 7 Colorful Accent 5" w:uiPriority="52"/>
+    <w:lsdException w:name="Grid Table 1 Light Accent 6" w:uiPriority="46"/>
+    <w:lsdException w:name="Grid Table 2 Accent 6" w:uiPriority="47"/>
+    <w:lsdException w:name="Grid Table 3 Accent 6" w:uiPriority="48"/>
+    <w:lsdException w:name="Grid Table 4 Accent 6" w:uiPriority="49"/>
+    <w:lsdException w:name="Grid Table 5 Dark Accent 6" w:uiPriority="50"/>
+    <w:lsdException w:name="Grid Table 6 Colorful Accent 6" w:uiPriority="51"/>
+    <w:lsdException w:name="Grid Table 7 Colorful Accent 6" w:uiPriority="52"/>
+    <w:lsdException w:name="List Table 1 Light" w:uiPriority="46"/>
+    <w:lsdException w:name="List Table 2" w:uiPriority="47"/>
+    <w:lsdException w:name="List Table 3" w:uiPriority="48"/>
+    <w:lsdException w:name="List Table 4" w:uiPriority="49"/>
+    <w:lsdException w:name="List Table 5 Dark" w:uiPriority="50"/>
+    <w:lsdException w:name="List Table 6 Colorful" w:uiPriority="51"/>
+    <w:lsdException w:name="List Table 7 Colorful" w:uiPriority="52"/>
+    <w:lsdException w:name="List Table 1 Light Accent 1" w:uiPriority="46"/>
+    <w:lsdException w:name="List Table 2 Accent 1" w:uiPriority="47"/>
+    <w:lsdException w:name="List Table 3 Accent 1" w:uiPriority="48"/>
+    <w:lsdException w:name="List Table 4 Accent 1" w:uiPriority="49"/>
+    <w:lsdException w:name="List Table 5 Dark Accent 1" w:uiPriority="50"/>
+    <w:lsdException w:name="List Table 6 Colorful Accent 1" w:uiPriority="51"/>
+    <w:lsdException w:name="List Table 7 Colorful Accent 1" w:uiPriority="52"/>
+    <w:lsdException w:name="List Table 1 Light Accent 2" w:uiPriority="46"/>
+    <w:lsdException w:name="List Table 2 Accent 2" w:uiPriority="47"/>
+    <w:lsdException w:name="List Table 3 Accent 2" w:uiPriority="48"/>
+    <w:lsdException w:name="List Table 4 Accent 2" w:uiPriority="49"/>
+    <w:lsdException w:name="List Table 5 Dark Accent 2" w:uiPriority="50"/>
+    <w:lsdException w:name="List Table 6 Colorful Accent 2" w:uiPriority="51"/>
+    <w:lsdException w:name="List Table 7 Colorful Accent 2" w:uiPriority="52"/>
+    <w:lsdException w:name="List Table 1 Light Accent 3" w:uiPriority="46"/>
+    <w:lsdException w:name="List Table 2 Accent 3" w:uiPriority="47"/>
+    <w:lsdException w:name="List Table 3 Accent 3" w:uiPriority="48"/>
+    <w:lsdException w:name="List Table 4 Accent 3" w:uiPriority="49"/>
+    <w:lsdException w:name="List Table 5 Dark Accent 3" w:uiPriority="50"/>
+    <w:lsdException w:name="List Table 6 Colorful Accent 3" w:uiPriority="51"/>
+    <w:lsdException w:name="List Table 7 Colorful Accent 3" w:uiPriority="52"/>
+    <w:lsdException w:name="List Table 1 Light Accent 4" w:uiPriority="46"/>
+    <w:lsdException w:name="List Table 2 Accent 4" w:uiPriority="47"/>
+    <w:lsdException w:name="List Table 3 Accent 4" w:uiPriority="48"/>
+    <w:lsdException w:name="List Table 4 Accent 4" w:uiPriority="49"/>
+    <w:lsdException w:name="List Table 5 Dark Accent 4" w:uiPriority="50"/>
+    <w:lsdException w:name="List Table 6 Colorful Accent 4" w:uiPriority="51"/>
+    <w:lsdException w:name="List Table 7 Colorful Accent 4" w:uiPriority="52"/>
+    <w:lsdException w:name="List Table 1 Light Accent 5" w:uiPriority="46"/>
+    <w:lsdException w:name="List Table 2 Accent 5" w:uiPriority="47"/>
+    <w:lsdException w:name="List Table 3 Accent 5" w:uiPriority="48"/>
+    <w:lsdException w:name="List Table 4 Accent 5" w:uiPriority="49"/>
+    <w:lsdException w:name="List Table 5 Dark Accent 5" w:uiPriority="50"/>
+    <w:lsdException w:name="List Table 6 Colorful Accent 5" w:uiPriority="51"/>
+    <w:lsdException w:name="List Table 7 Colorful Accent 5" w:uiPriority="52"/>
+    <w:lsdException w:name="List Table 1 Light Accent 6" w:uiPriority="46"/>
+    <w:lsdException w:name="List Table 2 Accent 6" w:uiPriority="47"/>
+    <w:lsdException w:name="List Table 3 Accent 6" w:uiPriority="48"/>
+    <w:lsdException w:name="List Table 4 Accent 6" w:uiPriority="49"/>
+    <w:lsdException w:name="List Table 5 Dark Accent 6" w:uiPriority="50"/>
+    <w:lsdException w:name="List Table 6 Colorful Accent 6" w:uiPriority="51"/>
+    <w:lsdException w:name="List Table 7 Colorful Accent 6" w:uiPriority="52"/>
+  </w:latentStyles>
+  <w:style w:type="paragraph" w:default="1" w:styleId="Normal">
     <w:name w:val="Normal"/>
     <w:qFormat/>
   </w:style>
-  <w:style w:styleId="BodyText" w:type="paragraph">
-    <w:name w:val="Body Text"/>
-    <w:basedOn w:val="Normal"/>
-    <w:link w:val="BodyTextChar"/>
-    <w:qFormat/>
-    <w:pPr>
-      <w:spacing w:after="180" w:before="180"/>
-    </w:pPr>
-  </w:style>
-  <w:style w:customStyle="1" w:styleId="FirstParagraph" w:type="paragraph">
-    <w:name w:val="First Paragraph"/>
-    <w:basedOn w:val="BodyText"/>
-    <w:next w:val="BodyText"/>
-    <w:qFormat/>
-  </w:style>
-  <w:style w:customStyle="1" w:styleId="Compact" w:type="paragraph">
-    <w:name w:val="Compact"/>
-    <w:basedOn w:val="BodyText"/>
-    <w:qFormat/>
-    <w:pPr>
-      <w:spacing w:after="36" w:before="36"/>
-    </w:pPr>
-  </w:style>
-  <w:style w:styleId="Title" w:type="paragraph">
-    <w:name w:val="Title"/>
-    <w:basedOn w:val="Normal"/>
-    <w:next w:val="BodyText"/>
-    <w:link w:val="TitleChar"/>
-    <w:uiPriority w:val="10"/>
-    <w:qFormat/>
-    <w:rsid w:val="00A10FD9"/>
-    <w:pPr>
-      <w:spacing w:after="80" w:line="240" w:lineRule="auto"/>
-      <w:contextualSpacing/>
-      <w:jc w:val="center"/>
-    </w:pPr>
-    <w:rPr>
-      <w:rFonts w:asciiTheme="majorHAnsi" w:cstheme="majorBidi" w:eastAsiaTheme="majorEastAsia" w:hAnsiTheme="majorHAnsi"/>
-      <w:spacing w:val="-10"/>
-      <w:kern w:val="28"/>
-      <w:sz w:val="56"/>
-      <w:szCs w:val="56"/>
-    </w:rPr>
-  </w:style>
-  <w:style w:customStyle="1" w:styleId="TitleChar" w:type="character">
-    <w:name w:val="Title Char"/>
-    <w:basedOn w:val="DefaultParagraphFont"/>
-    <w:link w:val="Title"/>
-    <w:uiPriority w:val="10"/>
-    <w:rsid w:val="00A10FD9"/>
-    <w:rPr>
-      <w:rFonts w:asciiTheme="majorHAnsi" w:cstheme="majorBidi" w:eastAsiaTheme="majorEastAsia" w:hAnsiTheme="majorHAnsi"/>
-      <w:spacing w:val="-10"/>
-      <w:kern w:val="28"/>
-      <w:sz w:val="56"/>
-      <w:szCs w:val="56"/>
-    </w:rPr>
-  </w:style>
-  <w:style w:styleId="Subtitle" w:type="paragraph">
-    <w:name w:val="Subtitle"/>
-    <w:basedOn w:val="Title"/>
-    <w:next w:val="BodyText"/>
-    <w:link w:val="SubtitleChar"/>
-    <w:uiPriority w:val="11"/>
-    <w:qFormat/>
-    <w:rsid w:val="00A10FD9"/>
-    <w:pPr>
-      <w:numPr>
-        <w:ilvl w:val="1"/>
-      </w:numPr>
-    </w:pPr>
-    <w:rPr>
-      <w:rFonts w:cstheme="majorBidi" w:eastAsiaTheme="majorEastAsia"/>
-      <w:spacing w:val="15"/>
-      <w:sz w:val="28"/>
-      <w:szCs w:val="28"/>
-    </w:rPr>
-  </w:style>
-  <w:style w:customStyle="1" w:styleId="SubtitleChar" w:type="character">
-    <w:name w:val="Subtitle Char"/>
-    <w:basedOn w:val="DefaultParagraphFont"/>
-    <w:link w:val="Subtitle"/>
-    <w:uiPriority w:val="11"/>
-    <w:rsid w:val="00A10FD9"/>
-    <w:rPr>
-      <w:rFonts w:cstheme="majorBidi" w:eastAsiaTheme="majorEastAsia"/>
-      <w:color w:themeColor="text1" w:themeTint="A6" w:val="595959"/>
-      <w:spacing w:val="15"/>
-      <w:sz w:val="28"/>
-      <w:szCs w:val="28"/>
-    </w:rPr>
-  </w:style>
-  <w:style w:customStyle="1" w:styleId="Author" w:type="paragraph">
-    <w:name w:val="Author"/>
-    <w:next w:val="BodyText"/>
-    <w:qFormat/>
-    <w:pPr>
-      <w:keepNext/>
-      <w:keepLines/>
-      <w:jc w:val="center"/>
-    </w:pPr>
-  </w:style>
-  <w:style w:styleId="Date" w:type="paragraph">
-    <w:name w:val="Date"/>
-    <w:next w:val="BodyText"/>
-    <w:qFormat/>
-    <w:pPr>
-      <w:keepNext/>
-      <w:keepLines/>
-      <w:jc w:val="center"/>
-    </w:pPr>
-  </w:style>
-  <w:style w:customStyle="1" w:styleId="AbstractTitle" w:type="paragraph">
-    <w:name w:val="Abstract Title"/>
-    <w:basedOn w:val="Normal"/>
-    <w:next w:val="Abstract"/>
-    <w:qFormat/>
-    <w:pPr>
-      <w:keepNext/>
-      <w:keepLines/>
-      <w:spacing w:after="0" w:before="300"/>
-      <w:jc w:val="center"/>
-    </w:pPr>
-    <w:rPr>
-      <w:b/>
-      <w:sz w:val="20"/>
-      <w:szCs w:val="20"/>
-    </w:rPr>
-  </w:style>
-  <w:style w:customStyle="1" w:styleId="Abstract" w:type="paragraph">
-    <w:name w:val="Abstract"/>
-    <w:basedOn w:val="Normal"/>
-    <w:next w:val="BodyText"/>
-    <w:qFormat/>
-    <w:pPr>
-      <w:keepNext/>
-      <w:keepLines/>
-      <w:spacing w:after="300" w:before="100"/>
-    </w:pPr>
-    <w:rPr>
-      <w:sz w:val="20"/>
-      <w:szCs w:val="20"/>
-    </w:rPr>
-  </w:style>
-  <w:style w:styleId="Bibliography" w:type="paragraph">
-    <w:name w:val="Bibliography"/>
-    <w:basedOn w:val="Normal"/>
-    <w:next w:val="Bibliography"/>
-    <w:qFormat/>
-    <w:pPr/>
-    <w:rPr/>
-  </w:style>
-  <w:style w:styleId="Heading1" w:type="paragraph">
+  <w:style w:type="paragraph" w:styleId="Heading1">
     <w:name w:val="heading 1"/>
     <w:basedOn w:val="Normal"/>
     <w:next w:val="BodyText"/>
@@ -1046,17 +2177,17 @@
     <w:pPr>
       <w:keepNext/>
       <w:keepLines/>
-      <w:spacing w:after="80" w:before="360"/>
+      <w:spacing w:before="360" w:after="80"/>
       <w:outlineLvl w:val="0"/>
     </w:pPr>
     <w:rPr>
-      <w:rFonts w:asciiTheme="majorHAnsi" w:cstheme="majorBidi" w:eastAsiaTheme="majorEastAsia" w:hAnsiTheme="majorHAnsi"/>
-      <w:color w:themeColor="accent1" w:themeShade="BF" w:val="0F4761"/>
+      <w:rFonts w:asciiTheme="majorHAnsi" w:eastAsiaTheme="majorEastAsia" w:hAnsiTheme="majorHAnsi" w:cstheme="majorBidi"/>
+      <w:color w:val="0F4761" w:themeColor="accent1" w:themeShade="BF"/>
       <w:sz w:val="40"/>
       <w:szCs w:val="40"/>
     </w:rPr>
   </w:style>
-  <w:style w:styleId="Heading2" w:type="paragraph">
+  <w:style w:type="paragraph" w:styleId="Heading2">
     <w:name w:val="heading 2"/>
     <w:basedOn w:val="Normal"/>
     <w:next w:val="BodyText"/>
@@ -1069,17 +2200,17 @@
     <w:pPr>
       <w:keepNext/>
       <w:keepLines/>
-      <w:spacing w:after="80" w:before="160"/>
+      <w:spacing w:before="160" w:after="80"/>
       <w:outlineLvl w:val="1"/>
     </w:pPr>
     <w:rPr>
-      <w:rFonts w:asciiTheme="majorHAnsi" w:cstheme="majorBidi" w:eastAsiaTheme="majorEastAsia" w:hAnsiTheme="majorHAnsi"/>
-      <w:color w:themeColor="accent1" w:themeShade="BF" w:val="0F4761"/>
+      <w:rFonts w:asciiTheme="majorHAnsi" w:eastAsiaTheme="majorEastAsia" w:hAnsiTheme="majorHAnsi" w:cstheme="majorBidi"/>
+      <w:color w:val="0F4761" w:themeColor="accent1" w:themeShade="BF"/>
       <w:sz w:val="32"/>
       <w:szCs w:val="32"/>
     </w:rPr>
   </w:style>
-  <w:style w:styleId="Heading3" w:type="paragraph">
+  <w:style w:type="paragraph" w:styleId="Heading3">
     <w:name w:val="heading 3"/>
     <w:basedOn w:val="Normal"/>
     <w:next w:val="BodyText"/>
@@ -1092,17 +2223,17 @@
     <w:pPr>
       <w:keepNext/>
       <w:keepLines/>
-      <w:spacing w:after="80" w:before="160"/>
+      <w:spacing w:before="160" w:after="80"/>
       <w:outlineLvl w:val="2"/>
     </w:pPr>
     <w:rPr>
-      <w:rFonts w:cstheme="majorBidi" w:eastAsiaTheme="majorEastAsia"/>
-      <w:color w:themeColor="accent1" w:themeShade="BF" w:val="0F4761"/>
+      <w:rFonts w:eastAsiaTheme="majorEastAsia" w:cstheme="majorBidi"/>
+      <w:color w:val="0F4761" w:themeColor="accent1" w:themeShade="BF"/>
       <w:sz w:val="28"/>
       <w:szCs w:val="28"/>
     </w:rPr>
   </w:style>
-  <w:style w:styleId="Heading4" w:type="paragraph">
+  <w:style w:type="paragraph" w:styleId="Heading4">
     <w:name w:val="heading 4"/>
     <w:basedOn w:val="Normal"/>
     <w:next w:val="BodyText"/>
@@ -1115,17 +2246,17 @@
     <w:pPr>
       <w:keepNext/>
       <w:keepLines/>
-      <w:spacing w:after="40" w:before="80"/>
+      <w:spacing w:before="80" w:after="40"/>
       <w:outlineLvl w:val="3"/>
     </w:pPr>
     <w:rPr>
-      <w:rFonts w:cstheme="majorBidi" w:eastAsiaTheme="majorEastAsia"/>
+      <w:rFonts w:eastAsiaTheme="majorEastAsia" w:cstheme="majorBidi"/>
       <w:i/>
       <w:iCs/>
-      <w:color w:themeColor="accent1" w:themeShade="BF" w:val="0F4761"/>
-    </w:rPr>
-  </w:style>
-  <w:style w:styleId="Heading5" w:type="paragraph">
+      <w:color w:val="0F4761" w:themeColor="accent1" w:themeShade="BF"/>
+    </w:rPr>
+  </w:style>
+  <w:style w:type="paragraph" w:styleId="Heading5">
     <w:name w:val="heading 5"/>
     <w:basedOn w:val="Normal"/>
     <w:next w:val="BodyText"/>
@@ -1138,15 +2269,15 @@
     <w:pPr>
       <w:keepNext/>
       <w:keepLines/>
-      <w:spacing w:after="40" w:before="80"/>
+      <w:spacing w:before="80" w:after="40"/>
       <w:outlineLvl w:val="4"/>
     </w:pPr>
     <w:rPr>
-      <w:rFonts w:cstheme="majorBidi" w:eastAsiaTheme="majorEastAsia"/>
-      <w:color w:themeColor="accent1" w:themeShade="BF" w:val="0F4761"/>
-    </w:rPr>
-  </w:style>
-  <w:style w:styleId="Heading6" w:type="paragraph">
+      <w:rFonts w:eastAsiaTheme="majorEastAsia" w:cstheme="majorBidi"/>
+      <w:color w:val="0F4761" w:themeColor="accent1" w:themeShade="BF"/>
+    </w:rPr>
+  </w:style>
+  <w:style w:type="paragraph" w:styleId="Heading6">
     <w:name w:val="heading 6"/>
     <w:basedOn w:val="Normal"/>
     <w:next w:val="BodyText"/>
@@ -1159,17 +2290,17 @@
     <w:pPr>
       <w:keepNext/>
       <w:keepLines/>
-      <w:spacing w:after="0" w:before="40"/>
+      <w:spacing w:before="40" w:after="0"/>
       <w:outlineLvl w:val="5"/>
     </w:pPr>
     <w:rPr>
-      <w:rFonts w:cstheme="majorBidi" w:eastAsiaTheme="majorEastAsia"/>
+      <w:rFonts w:eastAsiaTheme="majorEastAsia" w:cstheme="majorBidi"/>
       <w:i/>
       <w:iCs/>
-      <w:color w:themeColor="text1" w:themeTint="A6" w:val="595959"/>
-    </w:rPr>
-  </w:style>
-  <w:style w:styleId="Heading7" w:type="paragraph">
+      <w:color w:val="595959" w:themeColor="text1" w:themeTint="A6"/>
+    </w:rPr>
+  </w:style>
+  <w:style w:type="paragraph" w:styleId="Heading7">
     <w:name w:val="heading 7"/>
     <w:basedOn w:val="Normal"/>
     <w:next w:val="BodyText"/>
@@ -1182,15 +2313,15 @@
     <w:pPr>
       <w:keepNext/>
       <w:keepLines/>
-      <w:spacing w:after="0" w:before="40"/>
+      <w:spacing w:before="40" w:after="0"/>
       <w:outlineLvl w:val="6"/>
     </w:pPr>
     <w:rPr>
-      <w:rFonts w:cstheme="majorBidi" w:eastAsiaTheme="majorEastAsia"/>
-      <w:color w:themeColor="text1" w:themeTint="A6" w:val="595959"/>
-    </w:rPr>
-  </w:style>
-  <w:style w:styleId="Heading8" w:type="paragraph">
+      <w:rFonts w:eastAsiaTheme="majorEastAsia" w:cstheme="majorBidi"/>
+      <w:color w:val="595959" w:themeColor="text1" w:themeTint="A6"/>
+    </w:rPr>
+  </w:style>
+  <w:style w:type="paragraph" w:styleId="Heading8">
     <w:name w:val="heading 8"/>
     <w:basedOn w:val="Normal"/>
     <w:next w:val="BodyText"/>
@@ -1207,13 +2338,13 @@
       <w:outlineLvl w:val="7"/>
     </w:pPr>
     <w:rPr>
-      <w:rFonts w:cstheme="majorBidi" w:eastAsiaTheme="majorEastAsia"/>
+      <w:rFonts w:eastAsiaTheme="majorEastAsia" w:cstheme="majorBidi"/>
       <w:i/>
       <w:iCs/>
-      <w:color w:themeColor="text1" w:themeTint="D8" w:val="272727"/>
-    </w:rPr>
-  </w:style>
-  <w:style w:styleId="Heading9" w:type="paragraph">
+      <w:color w:val="272727" w:themeColor="text1" w:themeTint="D8"/>
+    </w:rPr>
+  </w:style>
+  <w:style w:type="paragraph" w:styleId="Heading9">
     <w:name w:val="heading 9"/>
     <w:basedOn w:val="Normal"/>
     <w:next w:val="BodyText"/>
@@ -1230,24 +2361,198 @@
       <w:outlineLvl w:val="8"/>
     </w:pPr>
     <w:rPr>
-      <w:rFonts w:cstheme="majorBidi" w:eastAsiaTheme="majorEastAsia"/>
-      <w:color w:themeColor="text1" w:themeTint="D8" w:val="272727"/>
-    </w:rPr>
-  </w:style>
-  <w:style w:customStyle="1" w:styleId="Heading1Char" w:type="character">
+      <w:rFonts w:eastAsiaTheme="majorEastAsia" w:cstheme="majorBidi"/>
+      <w:color w:val="272727" w:themeColor="text1" w:themeTint="D8"/>
+    </w:rPr>
+  </w:style>
+  <w:style w:type="character" w:default="1" w:styleId="DefaultParagraphFont">
+    <w:name w:val="Default Paragraph Font"/>
+    <w:uiPriority w:val="1"/>
+    <w:semiHidden/>
+    <w:unhideWhenUsed/>
+  </w:style>
+  <w:style w:type="table" w:default="1" w:styleId="TableNormal">
+    <w:name w:val="Normal Table"/>
+    <w:uiPriority w:val="99"/>
+    <w:semiHidden/>
+    <w:unhideWhenUsed/>
+    <w:tblPr>
+      <w:tblInd w:w="0" w:type="dxa"/>
+      <w:tblCellMar>
+        <w:top w:w="0" w:type="dxa"/>
+        <w:left w:w="108" w:type="dxa"/>
+        <w:bottom w:w="0" w:type="dxa"/>
+        <w:right w:w="108" w:type="dxa"/>
+      </w:tblCellMar>
+    </w:tblPr>
+  </w:style>
+  <w:style w:type="numbering" w:default="1" w:styleId="NoList">
+    <w:name w:val="No List"/>
+    <w:uiPriority w:val="99"/>
+    <w:semiHidden/>
+    <w:unhideWhenUsed/>
+  </w:style>
+  <w:style w:type="paragraph" w:styleId="BodyText">
+    <w:name w:val="Body Text"/>
+    <w:basedOn w:val="Normal"/>
+    <w:qFormat/>
+    <w:pPr>
+      <w:spacing w:before="180" w:after="180"/>
+    </w:pPr>
+  </w:style>
+  <w:style w:type="paragraph" w:customStyle="1" w:styleId="FirstParagraph">
+    <w:name w:val="First Paragraph"/>
+    <w:basedOn w:val="BodyText"/>
+    <w:next w:val="BodyText"/>
+    <w:qFormat/>
+  </w:style>
+  <w:style w:type="paragraph" w:customStyle="1" w:styleId="Compact">
+    <w:name w:val="Compact"/>
+    <w:basedOn w:val="BodyText"/>
+    <w:qFormat/>
+    <w:pPr>
+      <w:spacing w:before="36" w:after="36"/>
+    </w:pPr>
+  </w:style>
+  <w:style w:type="paragraph" w:styleId="Title">
+    <w:name w:val="Title"/>
+    <w:basedOn w:val="Normal"/>
+    <w:next w:val="BodyText"/>
+    <w:link w:val="TitleChar"/>
+    <w:uiPriority w:val="10"/>
+    <w:qFormat/>
+    <w:rsid w:val="00A10FD9"/>
+    <w:pPr>
+      <w:spacing w:after="80"/>
+      <w:contextualSpacing/>
+      <w:jc w:val="center"/>
+    </w:pPr>
+    <w:rPr>
+      <w:rFonts w:asciiTheme="majorHAnsi" w:eastAsiaTheme="majorEastAsia" w:hAnsiTheme="majorHAnsi" w:cstheme="majorBidi"/>
+      <w:spacing w:val="-10"/>
+      <w:kern w:val="28"/>
+      <w:sz w:val="56"/>
+      <w:szCs w:val="56"/>
+    </w:rPr>
+  </w:style>
+  <w:style w:type="character" w:customStyle="1" w:styleId="TitleChar">
+    <w:name w:val="Title Char"/>
+    <w:basedOn w:val="DefaultParagraphFont"/>
+    <w:link w:val="Title"/>
+    <w:uiPriority w:val="10"/>
+    <w:rsid w:val="00A10FD9"/>
+    <w:rPr>
+      <w:rFonts w:asciiTheme="majorHAnsi" w:eastAsiaTheme="majorEastAsia" w:hAnsiTheme="majorHAnsi" w:cstheme="majorBidi"/>
+      <w:spacing w:val="-10"/>
+      <w:kern w:val="28"/>
+      <w:sz w:val="56"/>
+      <w:szCs w:val="56"/>
+    </w:rPr>
+  </w:style>
+  <w:style w:type="paragraph" w:styleId="Subtitle">
+    <w:name w:val="Subtitle"/>
+    <w:basedOn w:val="Title"/>
+    <w:next w:val="BodyText"/>
+    <w:link w:val="SubtitleChar"/>
+    <w:uiPriority w:val="11"/>
+    <w:qFormat/>
+    <w:rsid w:val="00A10FD9"/>
+    <w:pPr>
+      <w:numPr>
+        <w:ilvl w:val="1"/>
+      </w:numPr>
+    </w:pPr>
+    <w:rPr>
+      <w:spacing w:val="15"/>
+      <w:sz w:val="28"/>
+      <w:szCs w:val="28"/>
+    </w:rPr>
+  </w:style>
+  <w:style w:type="character" w:customStyle="1" w:styleId="SubtitleChar">
+    <w:name w:val="Subtitle Char"/>
+    <w:basedOn w:val="DefaultParagraphFont"/>
+    <w:link w:val="Subtitle"/>
+    <w:uiPriority w:val="11"/>
+    <w:rsid w:val="00A10FD9"/>
+    <w:rPr>
+      <w:rFonts w:eastAsiaTheme="majorEastAsia" w:cstheme="majorBidi"/>
+      <w:color w:val="595959" w:themeColor="text1" w:themeTint="A6"/>
+      <w:spacing w:val="15"/>
+      <w:sz w:val="28"/>
+      <w:szCs w:val="28"/>
+    </w:rPr>
+  </w:style>
+  <w:style w:type="paragraph" w:customStyle="1" w:styleId="Author">
+    <w:name w:val="Author"/>
+    <w:next w:val="BodyText"/>
+    <w:qFormat/>
+    <w:pPr>
+      <w:keepNext/>
+      <w:keepLines/>
+      <w:jc w:val="center"/>
+    </w:pPr>
+  </w:style>
+  <w:style w:type="paragraph" w:styleId="Date">
+    <w:name w:val="Date"/>
+    <w:next w:val="BodyText"/>
+    <w:qFormat/>
+    <w:pPr>
+      <w:keepNext/>
+      <w:keepLines/>
+      <w:jc w:val="center"/>
+    </w:pPr>
+  </w:style>
+  <w:style w:type="paragraph" w:customStyle="1" w:styleId="AbstractTitle">
+    <w:name w:val="Abstract Title"/>
+    <w:basedOn w:val="Normal"/>
+    <w:next w:val="Abstract"/>
+    <w:qFormat/>
+    <w:pPr>
+      <w:keepNext/>
+      <w:keepLines/>
+      <w:spacing w:before="300" w:after="0"/>
+      <w:jc w:val="center"/>
+    </w:pPr>
+    <w:rPr>
+      <w:b/>
+      <w:sz w:val="20"/>
+      <w:szCs w:val="20"/>
+    </w:rPr>
+  </w:style>
+  <w:style w:type="paragraph" w:customStyle="1" w:styleId="Abstract">
+    <w:name w:val="Abstract"/>
+    <w:basedOn w:val="Normal"/>
+    <w:next w:val="BodyText"/>
+    <w:qFormat/>
+    <w:pPr>
+      <w:keepNext/>
+      <w:keepLines/>
+      <w:spacing w:before="100" w:after="300"/>
+    </w:pPr>
+    <w:rPr>
+      <w:sz w:val="20"/>
+      <w:szCs w:val="20"/>
+    </w:rPr>
+  </w:style>
+  <w:style w:type="paragraph" w:styleId="Bibliography">
+    <w:name w:val="Bibliography"/>
+    <w:basedOn w:val="Normal"/>
+    <w:qFormat/>
+  </w:style>
+  <w:style w:type="character" w:customStyle="1" w:styleId="Heading1Char">
     <w:name w:val="Heading 1 Char"/>
     <w:basedOn w:val="DefaultParagraphFont"/>
     <w:link w:val="Heading1"/>
     <w:uiPriority w:val="9"/>
     <w:rsid w:val="00A10FD9"/>
     <w:rPr>
-      <w:rFonts w:asciiTheme="majorHAnsi" w:cstheme="majorBidi" w:eastAsiaTheme="majorEastAsia" w:hAnsiTheme="majorHAnsi"/>
-      <w:color w:themeColor="accent1" w:themeShade="BF" w:val="0F4761"/>
+      <w:rFonts w:asciiTheme="majorHAnsi" w:eastAsiaTheme="majorEastAsia" w:hAnsiTheme="majorHAnsi" w:cstheme="majorBidi"/>
+      <w:color w:val="0F4761" w:themeColor="accent1" w:themeShade="BF"/>
       <w:sz w:val="40"/>
       <w:szCs w:val="40"/>
     </w:rPr>
   </w:style>
-  <w:style w:customStyle="1" w:styleId="Heading2Char" w:type="character">
+  <w:style w:type="character" w:customStyle="1" w:styleId="Heading2Char">
     <w:name w:val="Heading 2 Char"/>
     <w:basedOn w:val="DefaultParagraphFont"/>
     <w:link w:val="Heading2"/>
@@ -1255,13 +2560,13 @@
     <w:semiHidden/>
     <w:rsid w:val="00A10FD9"/>
     <w:rPr>
-      <w:rFonts w:asciiTheme="majorHAnsi" w:cstheme="majorBidi" w:eastAsiaTheme="majorEastAsia" w:hAnsiTheme="majorHAnsi"/>
-      <w:color w:themeColor="accent1" w:themeShade="BF" w:val="0F4761"/>
+      <w:rFonts w:asciiTheme="majorHAnsi" w:eastAsiaTheme="majorEastAsia" w:hAnsiTheme="majorHAnsi" w:cstheme="majorBidi"/>
+      <w:color w:val="0F4761" w:themeColor="accent1" w:themeShade="BF"/>
       <w:sz w:val="32"/>
       <w:szCs w:val="32"/>
     </w:rPr>
   </w:style>
-  <w:style w:customStyle="1" w:styleId="Heading3Char" w:type="character">
+  <w:style w:type="character" w:customStyle="1" w:styleId="Heading3Char">
     <w:name w:val="Heading 3 Char"/>
     <w:basedOn w:val="DefaultParagraphFont"/>
     <w:link w:val="Heading3"/>
@@ -1269,13 +2574,13 @@
     <w:semiHidden/>
     <w:rsid w:val="00A10FD9"/>
     <w:rPr>
-      <w:rFonts w:cstheme="majorBidi" w:eastAsiaTheme="majorEastAsia"/>
-      <w:color w:themeColor="accent1" w:themeShade="BF" w:val="0F4761"/>
+      <w:rFonts w:eastAsiaTheme="majorEastAsia" w:cstheme="majorBidi"/>
+      <w:color w:val="0F4761" w:themeColor="accent1" w:themeShade="BF"/>
       <w:sz w:val="28"/>
       <w:szCs w:val="28"/>
     </w:rPr>
   </w:style>
-  <w:style w:customStyle="1" w:styleId="Heading4Char" w:type="character">
+  <w:style w:type="character" w:customStyle="1" w:styleId="Heading4Char">
     <w:name w:val="Heading 4 Char"/>
     <w:basedOn w:val="DefaultParagraphFont"/>
     <w:link w:val="Heading4"/>
@@ -1283,13 +2588,13 @@
     <w:semiHidden/>
     <w:rsid w:val="00A10FD9"/>
     <w:rPr>
-      <w:rFonts w:cstheme="majorBidi" w:eastAsiaTheme="majorEastAsia"/>
+      <w:rFonts w:eastAsiaTheme="majorEastAsia" w:cstheme="majorBidi"/>
       <w:i/>
       <w:iCs/>
-      <w:color w:themeColor="accent1" w:themeShade="BF" w:val="0F4761"/>
-    </w:rPr>
-  </w:style>
-  <w:style w:customStyle="1" w:styleId="Heading5Char" w:type="character">
+      <w:color w:val="0F4761" w:themeColor="accent1" w:themeShade="BF"/>
+    </w:rPr>
+  </w:style>
+  <w:style w:type="character" w:customStyle="1" w:styleId="Heading5Char">
     <w:name w:val="Heading 5 Char"/>
     <w:basedOn w:val="DefaultParagraphFont"/>
     <w:link w:val="Heading5"/>
@@ -1297,11 +2602,11 @@
     <w:semiHidden/>
     <w:rsid w:val="00A10FD9"/>
     <w:rPr>
-      <w:rFonts w:cstheme="majorBidi" w:eastAsiaTheme="majorEastAsia"/>
-      <w:color w:themeColor="accent1" w:themeShade="BF" w:val="0F4761"/>
-    </w:rPr>
-  </w:style>
-  <w:style w:customStyle="1" w:styleId="Heading6Char" w:type="character">
+      <w:rFonts w:eastAsiaTheme="majorEastAsia" w:cstheme="majorBidi"/>
+      <w:color w:val="0F4761" w:themeColor="accent1" w:themeShade="BF"/>
+    </w:rPr>
+  </w:style>
+  <w:style w:type="character" w:customStyle="1" w:styleId="Heading6Char">
     <w:name w:val="Heading 6 Char"/>
     <w:basedOn w:val="DefaultParagraphFont"/>
     <w:link w:val="Heading6"/>
@@ -1309,13 +2614,13 @@
     <w:semiHidden/>
     <w:rsid w:val="00A10FD9"/>
     <w:rPr>
-      <w:rFonts w:cstheme="majorBidi" w:eastAsiaTheme="majorEastAsia"/>
+      <w:rFonts w:eastAsiaTheme="majorEastAsia" w:cstheme="majorBidi"/>
       <w:i/>
       <w:iCs/>
-      <w:color w:themeColor="text1" w:themeTint="A6" w:val="595959"/>
-    </w:rPr>
-  </w:style>
-  <w:style w:customStyle="1" w:styleId="Heading7Char" w:type="character">
+      <w:color w:val="595959" w:themeColor="text1" w:themeTint="A6"/>
+    </w:rPr>
+  </w:style>
+  <w:style w:type="character" w:customStyle="1" w:styleId="Heading7Char">
     <w:name w:val="Heading 7 Char"/>
     <w:basedOn w:val="DefaultParagraphFont"/>
     <w:link w:val="Heading7"/>
@@ -1323,11 +2628,11 @@
     <w:semiHidden/>
     <w:rsid w:val="00A10FD9"/>
     <w:rPr>
-      <w:rFonts w:cstheme="majorBidi" w:eastAsiaTheme="majorEastAsia"/>
-      <w:color w:themeColor="text1" w:themeTint="A6" w:val="595959"/>
-    </w:rPr>
-  </w:style>
-  <w:style w:customStyle="1" w:styleId="Heading8Char" w:type="character">
+      <w:rFonts w:eastAsiaTheme="majorEastAsia" w:cstheme="majorBidi"/>
+      <w:color w:val="595959" w:themeColor="text1" w:themeTint="A6"/>
+    </w:rPr>
+  </w:style>
+  <w:style w:type="character" w:customStyle="1" w:styleId="Heading8Char">
     <w:name w:val="Heading 8 Char"/>
     <w:basedOn w:val="DefaultParagraphFont"/>
     <w:link w:val="Heading8"/>
@@ -1335,13 +2640,13 @@
     <w:semiHidden/>
     <w:rsid w:val="00A10FD9"/>
     <w:rPr>
-      <w:rFonts w:cstheme="majorBidi" w:eastAsiaTheme="majorEastAsia"/>
+      <w:rFonts w:eastAsiaTheme="majorEastAsia" w:cstheme="majorBidi"/>
       <w:i/>
       <w:iCs/>
-      <w:color w:themeColor="text1" w:themeTint="D8" w:val="272727"/>
-    </w:rPr>
-  </w:style>
-  <w:style w:customStyle="1" w:styleId="Heading9Char" w:type="character">
+      <w:color w:val="272727" w:themeColor="text1" w:themeTint="D8"/>
+    </w:rPr>
+  </w:style>
+  <w:style w:type="character" w:customStyle="1" w:styleId="Heading9Char">
     <w:name w:val="Heading 9 Char"/>
     <w:basedOn w:val="DefaultParagraphFont"/>
     <w:link w:val="Heading9"/>
@@ -1349,11 +2654,11 @@
     <w:semiHidden/>
     <w:rsid w:val="00A10FD9"/>
     <w:rPr>
-      <w:rFonts w:cstheme="majorBidi" w:eastAsiaTheme="majorEastAsia"/>
-      <w:color w:themeColor="text1" w:themeTint="D8" w:val="272727"/>
-    </w:rPr>
-  </w:style>
-  <w:style w:styleId="BlockText" w:type="paragraph">
+      <w:rFonts w:eastAsiaTheme="majorEastAsia" w:cstheme="majorBidi"/>
+      <w:color w:val="272727" w:themeColor="text1" w:themeTint="D8"/>
+    </w:rPr>
+  </w:style>
+  <w:style w:type="paragraph" w:styleId="BlockText">
     <w:name w:val="Block Text"/>
     <w:basedOn w:val="BodyText"/>
     <w:next w:val="BodyText"/>
@@ -1361,19 +2666,18 @@
     <w:unhideWhenUsed/>
     <w:qFormat/>
     <w:pPr>
-      <w:spacing w:after="100" w:before="100"/>
-      <w:ind w:firstLine="0" w:left="480" w:right="480"/>
+      <w:spacing w:before="100" w:after="100"/>
+      <w:ind w:left="480" w:right="480"/>
     </w:pPr>
   </w:style>
-  <w:style w:styleId="FootnoteText" w:type="paragraph">
-    <w:name w:val="Footnote Text"/>
+  <w:style w:type="paragraph" w:styleId="FootnoteText">
+    <w:name w:val="footnote text"/>
     <w:basedOn w:val="Normal"/>
-    <w:next w:val="FootnoteText"/>
     <w:uiPriority w:val="9"/>
     <w:unhideWhenUsed/>
     <w:qFormat/>
   </w:style>
-  <w:style w:styleId="FootnoteBlockText" w:type="paragraph">
+  <w:style w:type="paragraph" w:customStyle="1" w:styleId="FootnoteBlockText">
     <w:name w:val="Footnote Block Text"/>
     <w:basedOn w:val="FootnoteText"/>
     <w:next w:val="FootnoteText"/>
@@ -1381,47 +2685,40 @@
     <w:unhideWhenUsed/>
     <w:qFormat/>
     <w:pPr>
-      <w:spacing w:after="100" w:before="100"/>
-      <w:ind w:firstLine="0" w:left="480" w:right="480"/>
+      <w:spacing w:before="100" w:after="100"/>
+      <w:ind w:left="480" w:right="480"/>
     </w:pPr>
   </w:style>
-  <w:style w:default="1" w:styleId="DefaultParagraphFont" w:type="character">
-    <w:name w:val="Default Paragraph Font"/>
-    <w:semiHidden/>
-    <w:unhideWhenUsed/>
-  </w:style>
-  <w:style w:default="1" w:styleId="Table" w:type="table">
+  <w:style w:type="table" w:customStyle="1" w:styleId="Table">
     <w:name w:val="Table"/>
-    <w:basedOn w:val="TableNormal"/>
     <w:semiHidden/>
     <w:unhideWhenUsed/>
     <w:qFormat/>
     <w:tblPr>
-      <w:tblInd w:type="dxa" w:w="0"/>
+      <w:tblInd w:w="0" w:type="dxa"/>
       <w:tblCellMar>
-        <w:top w:type="dxa" w:w="0"/>
-        <w:left w:type="dxa" w:w="108"/>
-        <w:bottom w:type="dxa" w:w="0"/>
-        <w:right w:type="dxa" w:w="108"/>
+        <w:top w:w="0" w:type="dxa"/>
+        <w:left w:w="108" w:type="dxa"/>
+        <w:bottom w:w="0" w:type="dxa"/>
+        <w:right w:w="108" w:type="dxa"/>
       </w:tblCellMar>
     </w:tblPr>
     <w:tblStylePr w:type="firstRow">
       <w:tblPr>
         <w:jc w:val="left"/>
-        <w:tblInd w:type="dxa" w:w="0"/>
       </w:tblPr>
       <w:trPr>
         <w:jc w:val="left"/>
       </w:trPr>
       <w:tcPr>
         <w:tcBorders>
-          <w:bottom w:val="single"/>
+          <w:bottom w:val="single" w:sz="0" w:space="0" w:color="auto"/>
         </w:tcBorders>
         <w:vAlign w:val="bottom"/>
       </w:tcPr>
     </w:tblStylePr>
   </w:style>
-  <w:style w:customStyle="1" w:styleId="DefinitionTerm" w:type="paragraph">
+  <w:style w:type="paragraph" w:customStyle="1" w:styleId="DefinitionTerm">
     <w:name w:val="Definition Term"/>
     <w:basedOn w:val="Normal"/>
     <w:next w:val="Definition"/>
@@ -1434,75 +2731,76 @@
       <w:b/>
     </w:rPr>
   </w:style>
-  <w:style w:customStyle="1" w:styleId="Definition" w:type="paragraph">
+  <w:style w:type="paragraph" w:customStyle="1" w:styleId="Definition">
     <w:name w:val="Definition"/>
     <w:basedOn w:val="Normal"/>
   </w:style>
-  <w:style w:styleId="Caption" w:type="paragraph">
-    <w:name w:val="Caption"/>
+  <w:style w:type="paragraph" w:styleId="Caption">
+    <w:name w:val="caption"/>
     <w:basedOn w:val="Normal"/>
-    <w:link w:val="BodyTextChar"/>
+    <w:link w:val="CaptionChar"/>
     <w:pPr>
-      <w:spacing w:after="120" w:before="0"/>
+      <w:spacing w:after="120"/>
     </w:pPr>
     <w:rPr>
       <w:i/>
     </w:rPr>
   </w:style>
-  <w:style w:customStyle="1" w:styleId="TableCaption" w:type="paragraph">
+  <w:style w:type="paragraph" w:customStyle="1" w:styleId="TableCaption">
     <w:name w:val="Table Caption"/>
     <w:basedOn w:val="Caption"/>
     <w:pPr>
       <w:keepNext/>
     </w:pPr>
   </w:style>
-  <w:style w:customStyle="1" w:styleId="ImageCaption" w:type="paragraph">
+  <w:style w:type="paragraph" w:customStyle="1" w:styleId="ImageCaption">
     <w:name w:val="Image Caption"/>
     <w:basedOn w:val="Caption"/>
   </w:style>
-  <w:style w:customStyle="1" w:styleId="Figure" w:type="paragraph">
+  <w:style w:type="paragraph" w:customStyle="1" w:styleId="Figure">
     <w:name w:val="Figure"/>
     <w:basedOn w:val="Normal"/>
   </w:style>
-  <w:style w:customStyle="1" w:styleId="CaptionedFigure" w:type="paragraph">
+  <w:style w:type="paragraph" w:customStyle="1" w:styleId="CaptionedFigure">
     <w:name w:val="Captioned Figure"/>
     <w:basedOn w:val="Figure"/>
     <w:pPr>
       <w:keepNext/>
     </w:pPr>
   </w:style>
-  <w:style w:customStyle="1" w:styleId="BodyTextChar" w:type="character">
-    <w:name w:val="Body Text Char"/>
+  <w:style w:type="character" w:customStyle="1" w:styleId="CaptionChar">
+    <w:name w:val="Caption Char"/>
     <w:basedOn w:val="DefaultParagraphFont"/>
-    <w:link w:val="BodyText"/>
-  </w:style>
-  <w:style w:customStyle="1" w:styleId="VerbatimChar" w:type="character">
+    <w:link w:val="Caption"/>
+  </w:style>
+  <w:style w:type="character" w:customStyle="1" w:styleId="VerbatimChar">
     <w:name w:val="Verbatim Char"/>
-    <w:basedOn w:val="BodyTextChar"/>
+    <w:basedOn w:val="CaptionChar"/>
+    <w:link w:val="SourceCode"/>
     <w:rPr>
       <w:rFonts w:ascii="Consolas" w:hAnsi="Consolas"/>
       <w:sz w:val="22"/>
     </w:rPr>
   </w:style>
-  <w:style w:customStyle="1" w:styleId="SectionNumber" w:type="character">
+  <w:style w:type="character" w:customStyle="1" w:styleId="SectionNumber">
     <w:name w:val="Section Number"/>
-    <w:basedOn w:val="BodyTextChar"/>
-  </w:style>
-  <w:style w:styleId="FootnoteReference" w:type="character">
-    <w:name w:val="Footnote Reference"/>
-    <w:basedOn w:val="BodyTextChar"/>
+    <w:basedOn w:val="CaptionChar"/>
+  </w:style>
+  <w:style w:type="character" w:styleId="FootnoteReference">
+    <w:name w:val="footnote reference"/>
+    <w:basedOn w:val="CaptionChar"/>
     <w:rPr>
       <w:vertAlign w:val="superscript"/>
     </w:rPr>
   </w:style>
-  <w:style w:styleId="Hyperlink" w:type="character">
+  <w:style w:type="character" w:styleId="Hyperlink">
     <w:name w:val="Hyperlink"/>
-    <w:basedOn w:val="BodyTextChar"/>
-    <w:rPr>
-      <w:color w:themeColor="accent1" w:val="4F81BD"/>
-    </w:rPr>
-  </w:style>
-  <w:style w:styleId="TOCHeading" w:type="paragraph">
+    <w:basedOn w:val="CaptionChar"/>
+    <w:rPr>
+      <w:color w:val="156082" w:themeColor="accent1"/>
+    </w:rPr>
+  </w:style>
+  <w:style w:type="paragraph" w:styleId="TOCHeading">
     <w:name w:val="TOC Heading"/>
     <w:basedOn w:val="Heading1"/>
     <w:next w:val="BodyText"/>
@@ -1513,274 +2811,379 @@
       <w:spacing w:before="240" w:line="259" w:lineRule="auto"/>
       <w:outlineLvl w:val="9"/>
     </w:pPr>
-    <w:rPr>
-      <w:rFonts w:asciiTheme="majorHAnsi" w:cstheme="majorBidi" w:eastAsiaTheme="majorEastAsia" w:hAnsiTheme="majorHAnsi"/>
-      <w:b w:val="0"/>
-      <w:bCs w:val="0"/>
-      <w:color w:themeColor="accent1" w:themeShade="BF" w:val="365F91"/>
-    </w:rPr>
   </w:style>
   <w:style w:type="paragraph" w:customStyle="1" w:styleId="SourceCode">
     <w:name w:val="Source Code"/>
     <w:basedOn w:val="Normal"/>
     <w:link w:val="VerbatimChar"/>
     <w:pPr>
-      <w:wordWrap w:val="off"/>
-      <w:shd w:val="clear" w:fill="f1f3f5"/>
+      <w:shd w:val="clear" w:color="auto" w:fill="F1F3F5"/>
+      <w:wordWrap w:val="0"/>
     </w:pPr>
   </w:style>
   <w:style w:type="character" w:customStyle="1" w:styleId="KeywordTok">
     <w:name w:val="KeywordTok"/>
     <w:basedOn w:val="VerbatimChar"/>
     <w:rPr>
+      <w:rFonts w:ascii="Consolas" w:hAnsi="Consolas"/>
       <w:b/>
-      <w:color w:val="003b4f"/>
-      <w:shd w:val="clear" w:fill="f1f3f5"/>
+      <w:color w:val="003B4F"/>
+      <w:sz w:val="22"/>
+      <w:shd w:val="clear" w:color="auto" w:fill="F1F3F5"/>
     </w:rPr>
   </w:style>
   <w:style w:type="character" w:customStyle="1" w:styleId="DataTypeTok">
     <w:name w:val="DataTypeTok"/>
     <w:basedOn w:val="VerbatimChar"/>
     <w:rPr>
-      <w:color w:val="ad0000"/>
-      <w:shd w:val="clear" w:fill="f1f3f5"/>
+      <w:rFonts w:ascii="Consolas" w:hAnsi="Consolas"/>
+      <w:color w:val="AD0000"/>
+      <w:sz w:val="22"/>
+      <w:shd w:val="clear" w:color="auto" w:fill="F1F3F5"/>
     </w:rPr>
   </w:style>
   <w:style w:type="character" w:customStyle="1" w:styleId="DecValTok">
     <w:name w:val="DecValTok"/>
     <w:basedOn w:val="VerbatimChar"/>
     <w:rPr>
-      <w:color w:val="ad0000"/>
-      <w:shd w:val="clear" w:fill="f1f3f5"/>
+      <w:rFonts w:ascii="Consolas" w:hAnsi="Consolas"/>
+      <w:color w:val="AD0000"/>
+      <w:sz w:val="22"/>
+      <w:shd w:val="clear" w:color="auto" w:fill="F1F3F5"/>
     </w:rPr>
   </w:style>
   <w:style w:type="character" w:customStyle="1" w:styleId="BaseNTok">
     <w:name w:val="BaseNTok"/>
     <w:basedOn w:val="VerbatimChar"/>
     <w:rPr>
-      <w:color w:val="ad0000"/>
-      <w:shd w:val="clear" w:fill="f1f3f5"/>
+      <w:rFonts w:ascii="Consolas" w:hAnsi="Consolas"/>
+      <w:color w:val="AD0000"/>
+      <w:sz w:val="22"/>
+      <w:shd w:val="clear" w:color="auto" w:fill="F1F3F5"/>
     </w:rPr>
   </w:style>
   <w:style w:type="character" w:customStyle="1" w:styleId="FloatTok">
     <w:name w:val="FloatTok"/>
     <w:basedOn w:val="VerbatimChar"/>
     <w:rPr>
-      <w:color w:val="ad0000"/>
-      <w:shd w:val="clear" w:fill="f1f3f5"/>
+      <w:rFonts w:ascii="Consolas" w:hAnsi="Consolas"/>
+      <w:color w:val="AD0000"/>
+      <w:sz w:val="22"/>
+      <w:shd w:val="clear" w:color="auto" w:fill="F1F3F5"/>
     </w:rPr>
   </w:style>
   <w:style w:type="character" w:customStyle="1" w:styleId="ConstantTok">
     <w:name w:val="ConstantTok"/>
     <w:basedOn w:val="VerbatimChar"/>
     <w:rPr>
-      <w:color w:val="8f5902"/>
-      <w:shd w:val="clear" w:fill="f1f3f5"/>
+      <w:rFonts w:ascii="Consolas" w:hAnsi="Consolas"/>
+      <w:color w:val="8F5902"/>
+      <w:sz w:val="22"/>
+      <w:shd w:val="clear" w:color="auto" w:fill="F1F3F5"/>
     </w:rPr>
   </w:style>
   <w:style w:type="character" w:customStyle="1" w:styleId="CharTok">
     <w:name w:val="CharTok"/>
     <w:basedOn w:val="VerbatimChar"/>
     <w:rPr>
-      <w:color w:val="20794d"/>
-      <w:shd w:val="clear" w:fill="f1f3f5"/>
+      <w:rFonts w:ascii="Consolas" w:hAnsi="Consolas"/>
+      <w:color w:val="20794D"/>
+      <w:sz w:val="22"/>
+      <w:shd w:val="clear" w:color="auto" w:fill="F1F3F5"/>
     </w:rPr>
   </w:style>
   <w:style w:type="character" w:customStyle="1" w:styleId="SpecialCharTok">
     <w:name w:val="SpecialCharTok"/>
     <w:basedOn w:val="VerbatimChar"/>
     <w:rPr>
-      <w:color w:val="5e5e5e"/>
-      <w:shd w:val="clear" w:fill="f1f3f5"/>
+      <w:rFonts w:ascii="Consolas" w:hAnsi="Consolas"/>
+      <w:color w:val="5E5E5E"/>
+      <w:sz w:val="22"/>
+      <w:shd w:val="clear" w:color="auto" w:fill="F1F3F5"/>
     </w:rPr>
   </w:style>
   <w:style w:type="character" w:customStyle="1" w:styleId="StringTok">
     <w:name w:val="StringTok"/>
     <w:basedOn w:val="VerbatimChar"/>
     <w:rPr>
-      <w:color w:val="20794d"/>
-      <w:shd w:val="clear" w:fill="f1f3f5"/>
+      <w:rFonts w:ascii="Consolas" w:hAnsi="Consolas"/>
+      <w:color w:val="20794D"/>
+      <w:sz w:val="22"/>
+      <w:shd w:val="clear" w:color="auto" w:fill="F1F3F5"/>
     </w:rPr>
   </w:style>
   <w:style w:type="character" w:customStyle="1" w:styleId="VerbatimStringTok">
     <w:name w:val="VerbatimStringTok"/>
     <w:basedOn w:val="VerbatimChar"/>
     <w:rPr>
-      <w:color w:val="20794d"/>
-      <w:shd w:val="clear" w:fill="f1f3f5"/>
+      <w:rFonts w:ascii="Consolas" w:hAnsi="Consolas"/>
+      <w:color w:val="20794D"/>
+      <w:sz w:val="22"/>
+      <w:shd w:val="clear" w:color="auto" w:fill="F1F3F5"/>
     </w:rPr>
   </w:style>
   <w:style w:type="character" w:customStyle="1" w:styleId="SpecialStringTok">
     <w:name w:val="SpecialStringTok"/>
     <w:basedOn w:val="VerbatimChar"/>
     <w:rPr>
-      <w:color w:val="20794d"/>
-      <w:shd w:val="clear" w:fill="f1f3f5"/>
+      <w:rFonts w:ascii="Consolas" w:hAnsi="Consolas"/>
+      <w:color w:val="20794D"/>
+      <w:sz w:val="22"/>
+      <w:shd w:val="clear" w:color="auto" w:fill="F1F3F5"/>
     </w:rPr>
   </w:style>
   <w:style w:type="character" w:customStyle="1" w:styleId="ImportTok">
     <w:name w:val="ImportTok"/>
     <w:basedOn w:val="VerbatimChar"/>
     <w:rPr>
-      <w:color w:val="00769e"/>
-      <w:shd w:val="clear" w:fill="f1f3f5"/>
+      <w:rFonts w:ascii="Consolas" w:hAnsi="Consolas"/>
+      <w:color w:val="00769E"/>
+      <w:sz w:val="22"/>
+      <w:shd w:val="clear" w:color="auto" w:fill="F1F3F5"/>
     </w:rPr>
   </w:style>
   <w:style w:type="character" w:customStyle="1" w:styleId="CommentTok">
     <w:name w:val="CommentTok"/>
     <w:basedOn w:val="VerbatimChar"/>
     <w:rPr>
-      <w:color w:val="5e5e5e"/>
-      <w:shd w:val="clear" w:fill="f1f3f5"/>
+      <w:rFonts w:ascii="Consolas" w:hAnsi="Consolas"/>
+      <w:color w:val="5E5E5E"/>
+      <w:sz w:val="22"/>
+      <w:shd w:val="clear" w:color="auto" w:fill="F1F3F5"/>
     </w:rPr>
   </w:style>
   <w:style w:type="character" w:customStyle="1" w:styleId="DocumentationTok">
     <w:name w:val="DocumentationTok"/>
     <w:basedOn w:val="VerbatimChar"/>
     <w:rPr>
+      <w:rFonts w:ascii="Consolas" w:hAnsi="Consolas"/>
       <w:i/>
-      <w:color w:val="5e5e5e"/>
-      <w:shd w:val="clear" w:fill="f1f3f5"/>
+      <w:color w:val="5E5E5E"/>
+      <w:sz w:val="22"/>
+      <w:shd w:val="clear" w:color="auto" w:fill="F1F3F5"/>
     </w:rPr>
   </w:style>
   <w:style w:type="character" w:customStyle="1" w:styleId="AnnotationTok">
     <w:name w:val="AnnotationTok"/>
     <w:basedOn w:val="VerbatimChar"/>
     <w:rPr>
-      <w:color w:val="5e5e5e"/>
-      <w:shd w:val="clear" w:fill="f1f3f5"/>
+      <w:rFonts w:ascii="Consolas" w:hAnsi="Consolas"/>
+      <w:color w:val="5E5E5E"/>
+      <w:sz w:val="22"/>
+      <w:shd w:val="clear" w:color="auto" w:fill="F1F3F5"/>
     </w:rPr>
   </w:style>
   <w:style w:type="character" w:customStyle="1" w:styleId="CommentVarTok">
     <w:name w:val="CommentVarTok"/>
     <w:basedOn w:val="VerbatimChar"/>
     <w:rPr>
+      <w:rFonts w:ascii="Consolas" w:hAnsi="Consolas"/>
       <w:i/>
-      <w:color w:val="5e5e5e"/>
-      <w:shd w:val="clear" w:fill="f1f3f5"/>
+      <w:color w:val="5E5E5E"/>
+      <w:sz w:val="22"/>
+      <w:shd w:val="clear" w:color="auto" w:fill="F1F3F5"/>
     </w:rPr>
   </w:style>
   <w:style w:type="character" w:customStyle="1" w:styleId="OtherTok">
     <w:name w:val="OtherTok"/>
     <w:basedOn w:val="VerbatimChar"/>
     <w:rPr>
-      <w:color w:val="003b4f"/>
-      <w:shd w:val="clear" w:fill="f1f3f5"/>
+      <w:rFonts w:ascii="Consolas" w:hAnsi="Consolas"/>
+      <w:color w:val="003B4F"/>
+      <w:sz w:val="22"/>
+      <w:shd w:val="clear" w:color="auto" w:fill="F1F3F5"/>
     </w:rPr>
   </w:style>
   <w:style w:type="character" w:customStyle="1" w:styleId="FunctionTok">
     <w:name w:val="FunctionTok"/>
     <w:basedOn w:val="VerbatimChar"/>
     <w:rPr>
-      <w:color w:val="4758ab"/>
-      <w:shd w:val="clear" w:fill="f1f3f5"/>
+      <w:rFonts w:ascii="Consolas" w:hAnsi="Consolas"/>
+      <w:color w:val="4758AB"/>
+      <w:sz w:val="22"/>
+      <w:shd w:val="clear" w:color="auto" w:fill="F1F3F5"/>
     </w:rPr>
   </w:style>
   <w:style w:type="character" w:customStyle="1" w:styleId="VariableTok">
     <w:name w:val="VariableTok"/>
     <w:basedOn w:val="VerbatimChar"/>
     <w:rPr>
+      <w:rFonts w:ascii="Consolas" w:hAnsi="Consolas"/>
       <w:color w:val="111111"/>
-      <w:shd w:val="clear" w:fill="f1f3f5"/>
+      <w:sz w:val="22"/>
+      <w:shd w:val="clear" w:color="auto" w:fill="F1F3F5"/>
     </w:rPr>
   </w:style>
   <w:style w:type="character" w:customStyle="1" w:styleId="ControlFlowTok">
     <w:name w:val="ControlFlowTok"/>
     <w:basedOn w:val="VerbatimChar"/>
     <w:rPr>
+      <w:rFonts w:ascii="Consolas" w:hAnsi="Consolas"/>
       <w:b/>
-      <w:color w:val="003b4f"/>
-      <w:shd w:val="clear" w:fill="f1f3f5"/>
+      <w:color w:val="003B4F"/>
+      <w:sz w:val="22"/>
+      <w:shd w:val="clear" w:color="auto" w:fill="F1F3F5"/>
     </w:rPr>
   </w:style>
   <w:style w:type="character" w:customStyle="1" w:styleId="OperatorTok">
     <w:name w:val="OperatorTok"/>
     <w:basedOn w:val="VerbatimChar"/>
     <w:rPr>
-      <w:color w:val="5e5e5e"/>
-      <w:shd w:val="clear" w:fill="f1f3f5"/>
+      <w:rFonts w:ascii="Consolas" w:hAnsi="Consolas"/>
+      <w:color w:val="5E5E5E"/>
+      <w:sz w:val="22"/>
+      <w:shd w:val="clear" w:color="auto" w:fill="F1F3F5"/>
     </w:rPr>
   </w:style>
   <w:style w:type="character" w:customStyle="1" w:styleId="BuiltInTok">
     <w:name w:val="BuiltInTok"/>
     <w:basedOn w:val="VerbatimChar"/>
     <w:rPr>
-      <w:color w:val="003b4f"/>
-      <w:shd w:val="clear" w:fill="f1f3f5"/>
+      <w:rFonts w:ascii="Consolas" w:hAnsi="Consolas"/>
+      <w:color w:val="003B4F"/>
+      <w:sz w:val="22"/>
+      <w:shd w:val="clear" w:color="auto" w:fill="F1F3F5"/>
     </w:rPr>
   </w:style>
   <w:style w:type="character" w:customStyle="1" w:styleId="ExtensionTok">
     <w:name w:val="ExtensionTok"/>
     <w:basedOn w:val="VerbatimChar"/>
     <w:rPr>
-      <w:color w:val="003b4f"/>
-      <w:shd w:val="clear" w:fill="f1f3f5"/>
+      <w:rFonts w:ascii="Consolas" w:hAnsi="Consolas"/>
+      <w:color w:val="003B4F"/>
+      <w:sz w:val="22"/>
+      <w:shd w:val="clear" w:color="auto" w:fill="F1F3F5"/>
     </w:rPr>
   </w:style>
   <w:style w:type="character" w:customStyle="1" w:styleId="PreprocessorTok">
     <w:name w:val="PreprocessorTok"/>
     <w:basedOn w:val="VerbatimChar"/>
     <w:rPr>
-      <w:color w:val="ad0000"/>
-      <w:shd w:val="clear" w:fill="f1f3f5"/>
+      <w:rFonts w:ascii="Consolas" w:hAnsi="Consolas"/>
+      <w:color w:val="AD0000"/>
+      <w:sz w:val="22"/>
+      <w:shd w:val="clear" w:color="auto" w:fill="F1F3F5"/>
     </w:rPr>
   </w:style>
   <w:style w:type="character" w:customStyle="1" w:styleId="AttributeTok">
     <w:name w:val="AttributeTok"/>
     <w:basedOn w:val="VerbatimChar"/>
     <w:rPr>
+      <w:rFonts w:ascii="Consolas" w:hAnsi="Consolas"/>
       <w:color w:val="657422"/>
-      <w:shd w:val="clear" w:fill="f1f3f5"/>
+      <w:sz w:val="22"/>
+      <w:shd w:val="clear" w:color="auto" w:fill="F1F3F5"/>
     </w:rPr>
   </w:style>
   <w:style w:type="character" w:customStyle="1" w:styleId="RegionMarkerTok">
     <w:name w:val="RegionMarkerTok"/>
     <w:basedOn w:val="VerbatimChar"/>
     <w:rPr>
-      <w:color w:val="003b4f"/>
-      <w:shd w:val="clear" w:fill="f1f3f5"/>
+      <w:rFonts w:ascii="Consolas" w:hAnsi="Consolas"/>
+      <w:color w:val="003B4F"/>
+      <w:sz w:val="22"/>
+      <w:shd w:val="clear" w:color="auto" w:fill="F1F3F5"/>
     </w:rPr>
   </w:style>
   <w:style w:type="character" w:customStyle="1" w:styleId="InformationTok">
     <w:name w:val="InformationTok"/>
     <w:basedOn w:val="VerbatimChar"/>
     <w:rPr>
-      <w:color w:val="5e5e5e"/>
-      <w:shd w:val="clear" w:fill="f1f3f5"/>
+      <w:rFonts w:ascii="Consolas" w:hAnsi="Consolas"/>
+      <w:color w:val="5E5E5E"/>
+      <w:sz w:val="22"/>
+      <w:shd w:val="clear" w:color="auto" w:fill="F1F3F5"/>
     </w:rPr>
   </w:style>
   <w:style w:type="character" w:customStyle="1" w:styleId="WarningTok">
     <w:name w:val="WarningTok"/>
     <w:basedOn w:val="VerbatimChar"/>
     <w:rPr>
+      <w:rFonts w:ascii="Consolas" w:hAnsi="Consolas"/>
       <w:i/>
-      <w:color w:val="5e5e5e"/>
-      <w:shd w:val="clear" w:fill="f1f3f5"/>
+      <w:color w:val="5E5E5E"/>
+      <w:sz w:val="22"/>
+      <w:shd w:val="clear" w:color="auto" w:fill="F1F3F5"/>
     </w:rPr>
   </w:style>
   <w:style w:type="character" w:customStyle="1" w:styleId="AlertTok">
     <w:name w:val="AlertTok"/>
     <w:basedOn w:val="VerbatimChar"/>
     <w:rPr>
-      <w:color w:val="ad0000"/>
-      <w:shd w:val="clear" w:fill="f1f3f5"/>
+      <w:rFonts w:ascii="Consolas" w:hAnsi="Consolas"/>
+      <w:color w:val="AD0000"/>
+      <w:sz w:val="22"/>
+      <w:shd w:val="clear" w:color="auto" w:fill="F1F3F5"/>
     </w:rPr>
   </w:style>
   <w:style w:type="character" w:customStyle="1" w:styleId="ErrorTok">
     <w:name w:val="ErrorTok"/>
     <w:basedOn w:val="VerbatimChar"/>
     <w:rPr>
-      <w:color w:val="ad0000"/>
-      <w:shd w:val="clear" w:fill="f1f3f5"/>
+      <w:rFonts w:ascii="Consolas" w:hAnsi="Consolas"/>
+      <w:color w:val="AD0000"/>
+      <w:sz w:val="22"/>
+      <w:shd w:val="clear" w:color="auto" w:fill="F1F3F5"/>
     </w:rPr>
   </w:style>
   <w:style w:type="character" w:customStyle="1" w:styleId="NormalTok">
     <w:name w:val="NormalTok"/>
     <w:basedOn w:val="VerbatimChar"/>
     <w:rPr>
-      <w:color w:val="003b4f"/>
-      <w:shd w:val="clear" w:fill="f1f3f5"/>
-    </w:rPr>
+      <w:rFonts w:ascii="Consolas" w:hAnsi="Consolas"/>
+      <w:color w:val="003B4F"/>
+      <w:sz w:val="22"/>
+      <w:shd w:val="clear" w:color="auto" w:fill="F1F3F5"/>
+    </w:rPr>
+  </w:style>
+  <w:style w:type="paragraph" w:styleId="Header">
+    <w:name w:val="header"/>
+    <w:basedOn w:val="Normal"/>
+    <w:link w:val="HeaderChar"/>
+    <w:unhideWhenUsed/>
+    <w:rsid w:val="00DE0F2F"/>
+    <w:pPr>
+      <w:tabs>
+        <w:tab w:val="center" w:pos="4680"/>
+        <w:tab w:val="right" w:pos="9360"/>
+      </w:tabs>
+      <w:spacing w:after="0"/>
+    </w:pPr>
+  </w:style>
+  <w:style w:type="character" w:customStyle="1" w:styleId="HeaderChar">
+    <w:name w:val="Header Char"/>
+    <w:basedOn w:val="DefaultParagraphFont"/>
+    <w:link w:val="Header"/>
+    <w:rsid w:val="00DE0F2F"/>
+  </w:style>
+  <w:style w:type="paragraph" w:styleId="Footer">
+    <w:name w:val="footer"/>
+    <w:basedOn w:val="Normal"/>
+    <w:link w:val="FooterChar"/>
+    <w:unhideWhenUsed/>
+    <w:rsid w:val="00DE0F2F"/>
+    <w:pPr>
+      <w:tabs>
+        <w:tab w:val="center" w:pos="4680"/>
+        <w:tab w:val="right" w:pos="9360"/>
+      </w:tabs>
+      <w:spacing w:after="0"/>
+    </w:pPr>
+  </w:style>
+  <w:style w:type="character" w:customStyle="1" w:styleId="FooterChar">
+    <w:name w:val="Footer Char"/>
+    <w:basedOn w:val="DefaultParagraphFont"/>
+    <w:link w:val="Footer"/>
+    <w:rsid w:val="00DE0F2F"/>
+  </w:style>
+  <w:style w:type="paragraph" w:styleId="ListParagraph">
+    <w:name w:val="List Paragraph"/>
+    <w:basedOn w:val="Normal"/>
+    <w:rsid w:val="00DE0F2F"/>
+    <w:pPr>
+      <w:ind w:left="720"/>
+      <w:contextualSpacing/>
+    </w:pPr>
   </w:style>
 </w:styles>
 </file>

</xml_diff>